<commit_message>
Refresh user engineering and help documentation
</commit_message>
<xml_diff>
--- a/docs/guides/WebsiteAnalytics_Engineering_Guide.docx
+++ b/docs/guides/WebsiteAnalytics_Engineering_Guide.docx
@@ -10,7 +10,7 @@
         <w:rPr>
           <w:b/>
           <w:color w:val="0B2341"/>
-          <w:sz w:val="48"/>
+          <w:sz w:val="56"/>
         </w:rPr>
         <w:t>Website Analytics Engineering Guide</w:t>
       </w:r>
@@ -21,44 +21,53 @@
       </w:pPr>
       <w:r>
         <w:rPr>
-          <w:color w:val="5A5A5A"/>
-          <w:sz w:val="26"/>
+          <w:color w:val="64748B"/>
+          <w:sz w:val="24"/>
         </w:rPr>
-        <w:t>Public repository technical guide for maintainers and contributors</w:t>
+        <w:t>Website Analytics GA4 Dashboard • Last changed July 23, 2026</w:t>
       </w:r>
     </w:p>
-    <w:p>
-      <w:pPr>
+    <w:p/>
+    <w:tbl>
+      <w:tblPr>
+        <w:tblW w:w="0" w:type="auto"/>
         <w:jc w:val="center"/>
-      </w:pPr>
-      <w:r>
-        <w:rPr>
-          <w:color w:val="5A5A5A"/>
-          <w:sz w:val="20"/>
-        </w:rPr>
-        <w:t>Last changed: July 23, 2026</w:t>
-      </w:r>
-    </w:p>
-    <w:p>
-      <w:pPr>
-        <w:jc w:val="center"/>
-      </w:pPr>
-      <w:r>
-        <w:t>Public repository edition draft</w:t>
-      </w:r>
-    </w:p>
-    <w:p>
-      <w:r>
-        <w:br w:type="page"/>
-      </w:r>
-    </w:p>
+        <w:tblCellMar>
+          <w:top w:w="120" w:type="dxa"/>
+          <w:left w:w="120" w:type="dxa"/>
+          <w:bottom w:w="120" w:type="dxa"/>
+          <w:right w:w="120" w:type="dxa"/>
+        </w:tblCellMar>
+        <w:tblLook w:val="04A0" w:firstRow="1" w:lastRow="0" w:firstColumn="1" w:lastColumn="0" w:noHBand="0" w:noVBand="1"/>
+      </w:tblPr>
+      <w:tblGrid>
+        <w:gridCol w:w="10080"/>
+      </w:tblGrid>
+      <w:tr>
+        <w:trPr>
+          <w:jc w:val="center"/>
+        </w:trPr>
+        <w:tc>
+          <w:tcPr>
+            <w:tcW w:w="10080" w:type="dxa"/>
+            <w:shd w:val="clear" w:color="auto" w:fill="EAF8FF"/>
+            <w:vAlign w:val="center"/>
+          </w:tcPr>
+          <w:p>
+            <w:r>
+              <w:t>This guide uses sanitized examples. Replace the sample site names, property IDs, OAuth client ID, and OAuth secret with your own values.</w:t>
+            </w:r>
+          </w:p>
+        </w:tc>
+      </w:tr>
+    </w:tbl>
+    <w:p/>
     <w:p>
       <w:pPr>
         <w:pStyle w:val="Heading1"/>
       </w:pPr>
-      <w:bookmarkStart w:id="0" w:name="_Toc235707710"/>
+      <w:bookmarkStart w:id="0" w:name="_Toc235732559"/>
       <w:r>
-        <w:lastRenderedPageBreak/>
         <w:t>Table of Contents</w:t>
       </w:r>
       <w:bookmarkEnd w:id="0"/>
@@ -67,7 +76,7 @@
       <w:pPr>
         <w:pStyle w:val="TOC1"/>
         <w:tabs>
-          <w:tab w:val="right" w:leader="dot" w:pos="9926"/>
+          <w:tab w:val="right" w:leader="dot" w:pos="10070"/>
         </w:tabs>
         <w:rPr>
           <w:noProof/>
@@ -82,7 +91,7 @@
       <w:r>
         <w:fldChar w:fldCharType="separate"/>
       </w:r>
-      <w:hyperlink w:anchor="_Toc235707710" w:history="1">
+      <w:hyperlink w:anchor="_Toc235732559" w:history="1">
         <w:r>
           <w:rPr>
             <w:rStyle w:val="Hyperlink"/>
@@ -109,7 +118,75 @@
             <w:noProof/>
             <w:webHidden/>
           </w:rPr>
-          <w:instrText xml:space="preserve"> PAGEREF _Toc235707710 \h </w:instrText>
+          <w:instrText xml:space="preserve"> PAGEREF _Toc235732559 \h </w:instrText>
+        </w:r>
+        <w:r>
+          <w:rPr>
+            <w:noProof/>
+            <w:webHidden/>
+          </w:rPr>
+        </w:r>
+        <w:r>
+          <w:rPr>
+            <w:noProof/>
+            <w:webHidden/>
+          </w:rPr>
+          <w:fldChar w:fldCharType="separate"/>
+        </w:r>
+        <w:r>
+          <w:rPr>
+            <w:noProof/>
+            <w:webHidden/>
+          </w:rPr>
+          <w:t>1</w:t>
+        </w:r>
+        <w:r>
+          <w:rPr>
+            <w:noProof/>
+            <w:webHidden/>
+          </w:rPr>
+          <w:fldChar w:fldCharType="end"/>
+        </w:r>
+      </w:hyperlink>
+    </w:p>
+    <w:p>
+      <w:pPr>
+        <w:pStyle w:val="TOC1"/>
+        <w:tabs>
+          <w:tab w:val="right" w:leader="dot" w:pos="10070"/>
+        </w:tabs>
+        <w:rPr>
+          <w:noProof/>
+        </w:rPr>
+      </w:pPr>
+      <w:hyperlink w:anchor="_Toc235732560" w:history="1">
+        <w:r>
+          <w:rPr>
+            <w:rStyle w:val="Hyperlink"/>
+            <w:noProof/>
+          </w:rPr>
+          <w:t>Architecture Overview</w:t>
+        </w:r>
+        <w:r>
+          <w:rPr>
+            <w:noProof/>
+            <w:webHidden/>
+          </w:rPr>
+          <w:tab/>
+        </w:r>
+        <w:r>
+          <w:rPr>
+            <w:noProof/>
+            <w:webHidden/>
+          </w:rPr>
+          <w:fldChar w:fldCharType="begin"/>
+        </w:r>
+        <w:r>
+          <w:rPr>
+            <w:noProof/>
+            <w:webHidden/>
+          </w:rPr>
+          <w:instrText xml:space="preserve"> PAGEREF _Toc235732560 \h </w:instrText>
         </w:r>
         <w:r>
           <w:rPr>
@@ -144,19 +221,19 @@
       <w:pPr>
         <w:pStyle w:val="TOC1"/>
         <w:tabs>
-          <w:tab w:val="right" w:leader="dot" w:pos="9926"/>
+          <w:tab w:val="right" w:leader="dot" w:pos="10070"/>
         </w:tabs>
         <w:rPr>
           <w:noProof/>
         </w:rPr>
       </w:pPr>
-      <w:hyperlink w:anchor="_Toc235707711" w:history="1">
+      <w:hyperlink w:anchor="_Toc235732561" w:history="1">
         <w:r>
           <w:rPr>
             <w:rStyle w:val="Hyperlink"/>
             <w:noProof/>
           </w:rPr>
-          <w:t>Engineering goals</w:t>
+          <w:t>Current Dashboard Surface</w:t>
         </w:r>
         <w:r>
           <w:rPr>
@@ -177,7 +254,7 @@
             <w:noProof/>
             <w:webHidden/>
           </w:rPr>
-          <w:instrText xml:space="preserve"> PAGEREF _Toc235707711 \h </w:instrText>
+          <w:instrText xml:space="preserve"> PAGEREF _Toc235732561 \h </w:instrText>
         </w:r>
         <w:r>
           <w:rPr>
@@ -212,19 +289,19 @@
       <w:pPr>
         <w:pStyle w:val="TOC1"/>
         <w:tabs>
-          <w:tab w:val="right" w:leader="dot" w:pos="9926"/>
+          <w:tab w:val="right" w:leader="dot" w:pos="10070"/>
         </w:tabs>
         <w:rPr>
           <w:noProof/>
         </w:rPr>
       </w:pPr>
-      <w:hyperlink w:anchor="_Toc235707712" w:history="1">
+      <w:hyperlink w:anchor="_Toc235732562" w:history="1">
         <w:r>
           <w:rPr>
             <w:rStyle w:val="Hyperlink"/>
             <w:noProof/>
           </w:rPr>
-          <w:t>Source module map</w:t>
+          <w:t>GA4 Reports Used</w:t>
         </w:r>
         <w:r>
           <w:rPr>
@@ -245,7 +322,7 @@
             <w:noProof/>
             <w:webHidden/>
           </w:rPr>
-          <w:instrText xml:space="preserve"> PAGEREF _Toc235707712 \h </w:instrText>
+          <w:instrText xml:space="preserve"> PAGEREF _Toc235732562 \h </w:instrText>
         </w:r>
         <w:r>
           <w:rPr>
@@ -280,19 +357,19 @@
       <w:pPr>
         <w:pStyle w:val="TOC1"/>
         <w:tabs>
-          <w:tab w:val="right" w:leader="dot" w:pos="9926"/>
+          <w:tab w:val="right" w:leader="dot" w:pos="10070"/>
         </w:tabs>
         <w:rPr>
           <w:noProof/>
         </w:rPr>
       </w:pPr>
-      <w:hyperlink w:anchor="_Toc235707713" w:history="1">
+      <w:hyperlink w:anchor="_Toc235732563" w:history="1">
         <w:r>
           <w:rPr>
             <w:rStyle w:val="Hyperlink"/>
             <w:noProof/>
           </w:rPr>
-          <w:t>Runtime data model</w:t>
+          <w:t>Authentication and Token Storage</w:t>
         </w:r>
         <w:r>
           <w:rPr>
@@ -313,7 +390,7 @@
             <w:noProof/>
             <w:webHidden/>
           </w:rPr>
-          <w:instrText xml:space="preserve"> PAGEREF _Toc235707713 \h </w:instrText>
+          <w:instrText xml:space="preserve"> PAGEREF _Toc235732563 \h </w:instrText>
         </w:r>
         <w:r>
           <w:rPr>
@@ -348,19 +425,19 @@
       <w:pPr>
         <w:pStyle w:val="TOC1"/>
         <w:tabs>
-          <w:tab w:val="right" w:leader="dot" w:pos="9926"/>
+          <w:tab w:val="right" w:leader="dot" w:pos="10070"/>
         </w:tabs>
         <w:rPr>
           <w:noProof/>
         </w:rPr>
       </w:pPr>
-      <w:hyperlink w:anchor="_Toc235707714" w:history="1">
+      <w:hyperlink w:anchor="_Toc235732564" w:history="1">
         <w:r>
           <w:rPr>
             <w:rStyle w:val="Hyperlink"/>
             <w:noProof/>
           </w:rPr>
-          <w:t>SQLite schema and public repository policy</w:t>
+          <w:t>Portable SQLite Settings</w:t>
         </w:r>
         <w:r>
           <w:rPr>
@@ -381,75 +458,7 @@
             <w:noProof/>
             <w:webHidden/>
           </w:rPr>
-          <w:instrText xml:space="preserve"> PAGEREF _Toc235707714 \h </w:instrText>
-        </w:r>
-        <w:r>
-          <w:rPr>
-            <w:noProof/>
-            <w:webHidden/>
-          </w:rPr>
-        </w:r>
-        <w:r>
-          <w:rPr>
-            <w:noProof/>
-            <w:webHidden/>
-          </w:rPr>
-          <w:fldChar w:fldCharType="separate"/>
-        </w:r>
-        <w:r>
-          <w:rPr>
-            <w:noProof/>
-            <w:webHidden/>
-          </w:rPr>
-          <w:t>3</w:t>
-        </w:r>
-        <w:r>
-          <w:rPr>
-            <w:noProof/>
-            <w:webHidden/>
-          </w:rPr>
-          <w:fldChar w:fldCharType="end"/>
-        </w:r>
-      </w:hyperlink>
-    </w:p>
-    <w:p>
-      <w:pPr>
-        <w:pStyle w:val="TOC1"/>
-        <w:tabs>
-          <w:tab w:val="right" w:leader="dot" w:pos="9926"/>
-        </w:tabs>
-        <w:rPr>
-          <w:noProof/>
-        </w:rPr>
-      </w:pPr>
-      <w:hyperlink w:anchor="_Toc235707715" w:history="1">
-        <w:r>
-          <w:rPr>
-            <w:rStyle w:val="Hyperlink"/>
-            <w:noProof/>
-          </w:rPr>
-          <w:t>Authentication design</w:t>
-        </w:r>
-        <w:r>
-          <w:rPr>
-            <w:noProof/>
-            <w:webHidden/>
-          </w:rPr>
-          <w:tab/>
-        </w:r>
-        <w:r>
-          <w:rPr>
-            <w:noProof/>
-            <w:webHidden/>
-          </w:rPr>
-          <w:fldChar w:fldCharType="begin"/>
-        </w:r>
-        <w:r>
-          <w:rPr>
-            <w:noProof/>
-            <w:webHidden/>
-          </w:rPr>
-          <w:instrText xml:space="preserve"> PAGEREF _Toc235707715 \h </w:instrText>
+          <w:instrText xml:space="preserve"> PAGEREF _Toc235732564 \h </w:instrText>
         </w:r>
         <w:r>
           <w:rPr>
@@ -484,19 +493,19 @@
       <w:pPr>
         <w:pStyle w:val="TOC1"/>
         <w:tabs>
-          <w:tab w:val="right" w:leader="dot" w:pos="9926"/>
+          <w:tab w:val="right" w:leader="dot" w:pos="10070"/>
         </w:tabs>
         <w:rPr>
           <w:noProof/>
         </w:rPr>
       </w:pPr>
-      <w:hyperlink w:anchor="_Toc235707716" w:history="1">
+      <w:hyperlink w:anchor="_Toc235732565" w:history="1">
         <w:r>
           <w:rPr>
             <w:rStyle w:val="Hyperlink"/>
             <w:noProof/>
           </w:rPr>
-          <w:t>GA4 request design</w:t>
+          <w:t>Designer/Editability Rules</w:t>
         </w:r>
         <w:r>
           <w:rPr>
@@ -517,7 +526,7 @@
             <w:noProof/>
             <w:webHidden/>
           </w:rPr>
-          <w:instrText xml:space="preserve"> PAGEREF _Toc235707716 \h </w:instrText>
+          <w:instrText xml:space="preserve"> PAGEREF _Toc235732565 \h </w:instrText>
         </w:r>
         <w:r>
           <w:rPr>
@@ -552,19 +561,19 @@
       <w:pPr>
         <w:pStyle w:val="TOC1"/>
         <w:tabs>
-          <w:tab w:val="right" w:leader="dot" w:pos="9926"/>
+          <w:tab w:val="right" w:leader="dot" w:pos="10070"/>
         </w:tabs>
         <w:rPr>
           <w:noProof/>
         </w:rPr>
       </w:pPr>
-      <w:hyperlink w:anchor="_Toc235707717" w:history="1">
+      <w:hyperlink w:anchor="_Toc235732566" w:history="1">
         <w:r>
           <w:rPr>
             <w:rStyle w:val="Hyperlink"/>
             <w:noProof/>
           </w:rPr>
-          <w:t>UI engineering notes</w:t>
+          <w:t>Build and Validation</w:t>
         </w:r>
         <w:r>
           <w:rPr>
@@ -585,75 +594,7 @@
             <w:noProof/>
             <w:webHidden/>
           </w:rPr>
-          <w:instrText xml:space="preserve"> PAGEREF _Toc235707717 \h </w:instrText>
-        </w:r>
-        <w:r>
-          <w:rPr>
-            <w:noProof/>
-            <w:webHidden/>
-          </w:rPr>
-        </w:r>
-        <w:r>
-          <w:rPr>
-            <w:noProof/>
-            <w:webHidden/>
-          </w:rPr>
-          <w:fldChar w:fldCharType="separate"/>
-        </w:r>
-        <w:r>
-          <w:rPr>
-            <w:noProof/>
-            <w:webHidden/>
-          </w:rPr>
-          <w:t>4</w:t>
-        </w:r>
-        <w:r>
-          <w:rPr>
-            <w:noProof/>
-            <w:webHidden/>
-          </w:rPr>
-          <w:fldChar w:fldCharType="end"/>
-        </w:r>
-      </w:hyperlink>
-    </w:p>
-    <w:p>
-      <w:pPr>
-        <w:pStyle w:val="TOC1"/>
-        <w:tabs>
-          <w:tab w:val="right" w:leader="dot" w:pos="9926"/>
-        </w:tabs>
-        <w:rPr>
-          <w:noProof/>
-        </w:rPr>
-      </w:pPr>
-      <w:hyperlink w:anchor="_Toc235707718" w:history="1">
-        <w:r>
-          <w:rPr>
-            <w:rStyle w:val="Hyperlink"/>
-            <w:noProof/>
-          </w:rPr>
-          <w:t>Build and smoke test</w:t>
-        </w:r>
-        <w:r>
-          <w:rPr>
-            <w:noProof/>
-            <w:webHidden/>
-          </w:rPr>
-          <w:tab/>
-        </w:r>
-        <w:r>
-          <w:rPr>
-            <w:noProof/>
-            <w:webHidden/>
-          </w:rPr>
-          <w:fldChar w:fldCharType="begin"/>
-        </w:r>
-        <w:r>
-          <w:rPr>
-            <w:noProof/>
-            <w:webHidden/>
-          </w:rPr>
-          <w:instrText xml:space="preserve"> PAGEREF _Toc235707718 \h </w:instrText>
+          <w:instrText xml:space="preserve"> PAGEREF _Toc235732566 \h </w:instrText>
         </w:r>
         <w:r>
           <w:rPr>
@@ -688,19 +629,19 @@
       <w:pPr>
         <w:pStyle w:val="TOC1"/>
         <w:tabs>
-          <w:tab w:val="right" w:leader="dot" w:pos="9926"/>
+          <w:tab w:val="right" w:leader="dot" w:pos="10070"/>
         </w:tabs>
         <w:rPr>
           <w:noProof/>
         </w:rPr>
       </w:pPr>
-      <w:hyperlink w:anchor="_Toc235707719" w:history="1">
+      <w:hyperlink w:anchor="_Toc235732567" w:history="1">
         <w:r>
           <w:rPr>
             <w:rStyle w:val="Hyperlink"/>
             <w:noProof/>
           </w:rPr>
-          <w:t>Open-source hardening checklist</w:t>
+          <w:t>Public Repository Hygiene</w:t>
         </w:r>
         <w:r>
           <w:rPr>
@@ -721,7 +662,7 @@
             <w:noProof/>
             <w:webHidden/>
           </w:rPr>
-          <w:instrText xml:space="preserve"> PAGEREF _Toc235707719 \h </w:instrText>
+          <w:instrText xml:space="preserve"> PAGEREF _Toc235732567 \h </w:instrText>
         </w:r>
         <w:r>
           <w:rPr>
@@ -753,142 +694,6 @@
       </w:hyperlink>
     </w:p>
     <w:p>
-      <w:pPr>
-        <w:pStyle w:val="TOC1"/>
-        <w:tabs>
-          <w:tab w:val="right" w:leader="dot" w:pos="9926"/>
-        </w:tabs>
-        <w:rPr>
-          <w:noProof/>
-        </w:rPr>
-      </w:pPr>
-      <w:hyperlink w:anchor="_Toc235707720" w:history="1">
-        <w:r>
-          <w:rPr>
-            <w:rStyle w:val="Hyperlink"/>
-            <w:noProof/>
-          </w:rPr>
-          <w:t>Contribution workflow</w:t>
-        </w:r>
-        <w:r>
-          <w:rPr>
-            <w:noProof/>
-            <w:webHidden/>
-          </w:rPr>
-          <w:tab/>
-        </w:r>
-        <w:r>
-          <w:rPr>
-            <w:noProof/>
-            <w:webHidden/>
-          </w:rPr>
-          <w:fldChar w:fldCharType="begin"/>
-        </w:r>
-        <w:r>
-          <w:rPr>
-            <w:noProof/>
-            <w:webHidden/>
-          </w:rPr>
-          <w:instrText xml:space="preserve"> PAGEREF _Toc235707720 \h </w:instrText>
-        </w:r>
-        <w:r>
-          <w:rPr>
-            <w:noProof/>
-            <w:webHidden/>
-          </w:rPr>
-        </w:r>
-        <w:r>
-          <w:rPr>
-            <w:noProof/>
-            <w:webHidden/>
-          </w:rPr>
-          <w:fldChar w:fldCharType="separate"/>
-        </w:r>
-        <w:r>
-          <w:rPr>
-            <w:noProof/>
-            <w:webHidden/>
-          </w:rPr>
-          <w:t>5</w:t>
-        </w:r>
-        <w:r>
-          <w:rPr>
-            <w:noProof/>
-            <w:webHidden/>
-          </w:rPr>
-          <w:fldChar w:fldCharType="end"/>
-        </w:r>
-      </w:hyperlink>
-    </w:p>
-    <w:p>
-      <w:pPr>
-        <w:pStyle w:val="TOC1"/>
-        <w:tabs>
-          <w:tab w:val="right" w:leader="dot" w:pos="9926"/>
-        </w:tabs>
-        <w:rPr>
-          <w:noProof/>
-        </w:rPr>
-      </w:pPr>
-      <w:hyperlink w:anchor="_Toc235707721" w:history="1">
-        <w:r>
-          <w:rPr>
-            <w:rStyle w:val="Hyperlink"/>
-            <w:noProof/>
-          </w:rPr>
-          <w:t>Future extension points</w:t>
-        </w:r>
-        <w:r>
-          <w:rPr>
-            <w:noProof/>
-            <w:webHidden/>
-          </w:rPr>
-          <w:tab/>
-        </w:r>
-        <w:r>
-          <w:rPr>
-            <w:noProof/>
-            <w:webHidden/>
-          </w:rPr>
-          <w:fldChar w:fldCharType="begin"/>
-        </w:r>
-        <w:r>
-          <w:rPr>
-            <w:noProof/>
-            <w:webHidden/>
-          </w:rPr>
-          <w:instrText xml:space="preserve"> PAGEREF _Toc235707721 \h </w:instrText>
-        </w:r>
-        <w:r>
-          <w:rPr>
-            <w:noProof/>
-            <w:webHidden/>
-          </w:rPr>
-        </w:r>
-        <w:r>
-          <w:rPr>
-            <w:noProof/>
-            <w:webHidden/>
-          </w:rPr>
-          <w:fldChar w:fldCharType="separate"/>
-        </w:r>
-        <w:r>
-          <w:rPr>
-            <w:noProof/>
-            <w:webHidden/>
-          </w:rPr>
-          <w:t>6</w:t>
-        </w:r>
-        <w:r>
-          <w:rPr>
-            <w:noProof/>
-            <w:webHidden/>
-          </w:rPr>
-          <w:fldChar w:fldCharType="end"/>
-        </w:r>
-      </w:hyperlink>
-    </w:p>
-    <w:p>
       <w:r>
         <w:fldChar w:fldCharType="end"/>
       </w:r>
@@ -902,65 +707,35 @@
       <w:pPr>
         <w:pStyle w:val="Heading1"/>
       </w:pPr>
-      <w:bookmarkStart w:id="1" w:name="_Toc235707711"/>
+      <w:bookmarkStart w:id="1" w:name="_Toc235732560"/>
       <w:r>
         <w:lastRenderedPageBreak/>
-        <w:t>Engineering goals</w:t>
+        <w:t>Architecture Overview</w:t>
       </w:r>
       <w:bookmarkEnd w:id="1"/>
     </w:p>
     <w:p>
-      <w:pPr>
-        <w:pStyle w:val="ListBullet"/>
-      </w:pPr>
       <w:r>
-        <w:t>Keep the dashboard simple, fast, and readable.</w:t>
+        <w:t>The application is a Delphi FMX desktop dashboard. Forms remain editable in the IDE. Runtime code retrieves GA4 data, maps responses into memory models, and updates existing designer controls.</w:t>
       </w:r>
-    </w:p>
-    <w:p>
-      <w:pPr>
-        <w:pStyle w:val="ListBullet"/>
-      </w:pPr>
-      <w:r>
-        <w:t>Keep FMX forms editable in the Delphi IDE. Avoid runtime-only UI construction unless the maintainer explicitly approves it.</w:t>
-      </w:r>
-    </w:p>
-    <w:p>
-      <w:pPr>
-        <w:pStyle w:val="ListBullet"/>
-      </w:pPr>
-      <w:r>
-        <w:t>Keep analytics results memory-only. Persist only local settings and user-owned OAuth refresh material.</w:t>
-      </w:r>
-    </w:p>
-    <w:p>
-      <w:pPr>
-        <w:pStyle w:val="ListBullet"/>
-      </w:pPr>
-      <w:r>
-        <w:t>Keep the public repository safe: no local databases, no secrets, no generated build output, no personal paths.</w:t>
-      </w:r>
-    </w:p>
-    <w:p>
-      <w:pPr>
-        <w:pStyle w:val="Heading1"/>
-      </w:pPr>
-      <w:bookmarkStart w:id="2" w:name="_Toc235707712"/>
-      <w:r>
-        <w:t>Source module map</w:t>
-      </w:r>
-      <w:bookmarkEnd w:id="2"/>
     </w:p>
     <w:tbl>
       <w:tblPr>
         <w:tblStyle w:val="TableGrid"/>
         <w:tblW w:w="0" w:type="auto"/>
         <w:jc w:val="center"/>
+        <w:tblCellMar>
+          <w:top w:w="120" w:type="dxa"/>
+          <w:left w:w="120" w:type="dxa"/>
+          <w:bottom w:w="120" w:type="dxa"/>
+          <w:right w:w="120" w:type="dxa"/>
+        </w:tblCellMar>
         <w:tblLook w:val="04A0" w:firstRow="1" w:lastRow="0" w:firstColumn="1" w:lastColumn="0" w:noHBand="0" w:noVBand="1"/>
       </w:tblPr>
       <w:tblGrid>
-        <w:gridCol w:w="4968"/>
-        <w:gridCol w:w="4968"/>
+        <w:gridCol w:w="2915"/>
+        <w:gridCol w:w="4451"/>
+        <w:gridCol w:w="2954"/>
       </w:tblGrid>
       <w:tr>
         <w:trPr>
@@ -968,39 +743,34 @@
         </w:trPr>
         <w:tc>
           <w:tcPr>
-            <w:tcW w:w="4968" w:type="dxa"/>
+            <w:tcW w:w="3360" w:type="dxa"/>
             <w:shd w:val="clear" w:color="auto" w:fill="E8EEF5"/>
-            <w:vAlign w:val="center"/>
           </w:tcPr>
           <w:p>
-            <w:pPr>
-              <w:spacing w:after="0"/>
-            </w:pPr>
             <w:r>
-              <w:rPr>
-                <w:b/>
-                <w:sz w:val="19"/>
-              </w:rPr>
-              <w:t>Module</w:t>
+              <w:t>Area</w:t>
             </w:r>
           </w:p>
         </w:tc>
         <w:tc>
           <w:tcPr>
-            <w:tcW w:w="4968" w:type="dxa"/>
+            <w:tcW w:w="3360" w:type="dxa"/>
             <w:shd w:val="clear" w:color="auto" w:fill="E8EEF5"/>
-            <w:vAlign w:val="center"/>
           </w:tcPr>
           <w:p>
-            <w:pPr>
-              <w:spacing w:after="0"/>
-            </w:pPr>
             <w:r>
-              <w:rPr>
-                <w:b/>
-                <w:sz w:val="19"/>
-              </w:rPr>
-              <w:t>Responsibility</w:t>
+              <w:t>Primary unit</w:t>
+            </w:r>
+          </w:p>
+        </w:tc>
+        <w:tc>
+          <w:tcPr>
+            <w:tcW w:w="3360" w:type="dxa"/>
+            <w:shd w:val="clear" w:color="auto" w:fill="E8EEF5"/>
+          </w:tcPr>
+          <w:p>
+            <w:r>
+              <w:t>Purpose</w:t>
             </w:r>
           </w:p>
         </w:tc>
@@ -1011,35 +781,31 @@
         </w:trPr>
         <w:tc>
           <w:tcPr>
-            <w:tcW w:w="4968" w:type="dxa"/>
-            <w:vAlign w:val="center"/>
+            <w:tcW w:w="3360" w:type="dxa"/>
           </w:tcPr>
           <w:p>
-            <w:pPr>
-              <w:spacing w:after="0"/>
-            </w:pPr>
             <w:r>
-              <w:rPr>
-                <w:sz w:val="19"/>
-              </w:rPr>
+              <w:t>Dashboard form</w:t>
+            </w:r>
+          </w:p>
+        </w:tc>
+        <w:tc>
+          <w:tcPr>
+            <w:tcW w:w="3360" w:type="dxa"/>
+          </w:tcPr>
+          <w:p>
+            <w:r>
               <w:t>WebsiteAnalytics.MainForm.pas/.fmx</w:t>
             </w:r>
           </w:p>
         </w:tc>
         <w:tc>
           <w:tcPr>
-            <w:tcW w:w="4968" w:type="dxa"/>
-            <w:vAlign w:val="center"/>
+            <w:tcW w:w="3360" w:type="dxa"/>
           </w:tcPr>
           <w:p>
-            <w:pPr>
-              <w:spacing w:after="0"/>
-            </w:pPr>
             <w:r>
-              <w:rPr>
-                <w:sz w:val="19"/>
-              </w:rPr>
-              <w:t>Main dashboard, filters, summary cards, grids/charts, update flow, status, help/settings buttons.</w:t>
+              <w:t>Hero, summary cards, chart paint boxes, grids, realtime panel, update timers.</w:t>
             </w:r>
           </w:p>
         </w:tc>
@@ -1050,35 +816,31 @@
         </w:trPr>
         <w:tc>
           <w:tcPr>
-            <w:tcW w:w="4968" w:type="dxa"/>
-            <w:vAlign w:val="center"/>
+            <w:tcW w:w="3360" w:type="dxa"/>
           </w:tcPr>
           <w:p>
-            <w:pPr>
-              <w:spacing w:after="0"/>
-            </w:pPr>
             <w:r>
-              <w:rPr>
-                <w:sz w:val="19"/>
-              </w:rPr>
+              <w:t>GA4 access</w:t>
+            </w:r>
+          </w:p>
+        </w:tc>
+        <w:tc>
+          <w:tcPr>
+            <w:tcW w:w="3360" w:type="dxa"/>
+          </w:tcPr>
+          <w:p>
+            <w:r>
               <w:t>WebsiteAnalytics.GA4DataModule.pas</w:t>
             </w:r>
           </w:p>
         </w:tc>
         <w:tc>
           <w:tcPr>
-            <w:tcW w:w="4968" w:type="dxa"/>
-            <w:vAlign w:val="center"/>
+            <w:tcW w:w="3360" w:type="dxa"/>
           </w:tcPr>
           <w:p>
-            <w:pPr>
-              <w:spacing w:after="0"/>
-            </w:pPr>
             <w:r>
-              <w:rPr>
-                <w:sz w:val="19"/>
-              </w:rPr>
-              <w:t>GA4 Data API requests, response parsing, standard report and realtime retrieval.</w:t>
+              <w:t>Builds GA4 Data API and Realtime API requests and parses responses.</w:t>
             </w:r>
           </w:p>
         </w:tc>
@@ -1089,35 +851,31 @@
         </w:trPr>
         <w:tc>
           <w:tcPr>
-            <w:tcW w:w="4968" w:type="dxa"/>
-            <w:vAlign w:val="center"/>
+            <w:tcW w:w="3360" w:type="dxa"/>
           </w:tcPr>
           <w:p>
-            <w:pPr>
-              <w:spacing w:after="0"/>
-            </w:pPr>
             <w:r>
-              <w:rPr>
-                <w:sz w:val="19"/>
-              </w:rPr>
+              <w:t>Authentication</w:t>
+            </w:r>
+          </w:p>
+        </w:tc>
+        <w:tc>
+          <w:tcPr>
+            <w:tcW w:w="3360" w:type="dxa"/>
+          </w:tcPr>
+          <w:p>
+            <w:r>
               <w:t>WebsiteAnalytics.AuthenticationDataModule.pas</w:t>
             </w:r>
           </w:p>
         </w:tc>
         <w:tc>
           <w:tcPr>
-            <w:tcW w:w="4968" w:type="dxa"/>
-            <w:vAlign w:val="center"/>
+            <w:tcW w:w="3360" w:type="dxa"/>
           </w:tcPr>
           <w:p>
-            <w:pPr>
-              <w:spacing w:after="0"/>
-            </w:pPr>
             <w:r>
-              <w:rPr>
-                <w:sz w:val="19"/>
-              </w:rPr>
-              <w:t>OAuth desktop flow, loopback listener, token exchange, refresh-token retry, DPAPI protection.</w:t>
+              <w:t>Desktop OAuth, loopback redirect, refresh-token persistence.</w:t>
             </w:r>
           </w:p>
         </w:tc>
@@ -1128,35 +886,31 @@
         </w:trPr>
         <w:tc>
           <w:tcPr>
-            <w:tcW w:w="4968" w:type="dxa"/>
-            <w:vAlign w:val="center"/>
+            <w:tcW w:w="3360" w:type="dxa"/>
           </w:tcPr>
           <w:p>
-            <w:pPr>
-              <w:spacing w:after="0"/>
-            </w:pPr>
             <w:r>
-              <w:rPr>
-                <w:sz w:val="19"/>
-              </w:rPr>
+              <w:t>Settings</w:t>
+            </w:r>
+          </w:p>
+        </w:tc>
+        <w:tc>
+          <w:tcPr>
+            <w:tcW w:w="3360" w:type="dxa"/>
+          </w:tcPr>
+          <w:p>
+            <w:r>
               <w:t>WebsiteAnalytics.SettingsDataModule.pas</w:t>
             </w:r>
           </w:p>
         </w:tc>
         <w:tc>
           <w:tcPr>
-            <w:tcW w:w="4968" w:type="dxa"/>
-            <w:vAlign w:val="center"/>
+            <w:tcW w:w="3360" w:type="dxa"/>
           </w:tcPr>
           <w:p>
-            <w:pPr>
-              <w:spacing w:after="0"/>
-            </w:pPr>
             <w:r>
-              <w:rPr>
-                <w:sz w:val="19"/>
-              </w:rPr>
-              <w:t>SQLite schema creation, defaults, and read/write access.</w:t>
+              <w:t>Portable SQLite settings database and schema.</w:t>
             </w:r>
           </w:p>
         </w:tc>
@@ -1167,152 +921,31 @@
         </w:trPr>
         <w:tc>
           <w:tcPr>
-            <w:tcW w:w="4968" w:type="dxa"/>
-            <w:vAlign w:val="center"/>
+            <w:tcW w:w="3360" w:type="dxa"/>
           </w:tcPr>
           <w:p>
-            <w:pPr>
-              <w:spacing w:after="0"/>
-            </w:pPr>
             <w:r>
-              <w:rPr>
-                <w:sz w:val="19"/>
-              </w:rPr>
-              <w:t>WebsiteAnalytics.SettingsForm.pas/.fmx</w:t>
+              <w:t>Models</w:t>
             </w:r>
           </w:p>
         </w:tc>
         <w:tc>
           <w:tcPr>
-            <w:tcW w:w="4968" w:type="dxa"/>
-            <w:vAlign w:val="center"/>
+            <w:tcW w:w="3360" w:type="dxa"/>
           </w:tcPr>
           <w:p>
-            <w:pPr>
-              <w:spacing w:after="0"/>
-            </w:pPr>
             <w:r>
-              <w:rPr>
-                <w:sz w:val="19"/>
-              </w:rPr>
-              <w:t>OAuth and dashboard settings UI, masked secret handling, connect/disconnect commands.</w:t>
-            </w:r>
-          </w:p>
-        </w:tc>
-      </w:tr>
-      <w:tr>
-        <w:trPr>
-          <w:jc w:val="center"/>
-        </w:trPr>
-        <w:tc>
-          <w:tcPr>
-            <w:tcW w:w="4968" w:type="dxa"/>
-            <w:vAlign w:val="center"/>
-          </w:tcPr>
-          <w:p>
-            <w:pPr>
-              <w:spacing w:after="0"/>
-            </w:pPr>
-            <w:r>
-              <w:rPr>
-                <w:sz w:val="19"/>
-              </w:rPr>
-              <w:t>WebsiteAnalytics.PropertyManagerForm.pas/.fmx</w:t>
-            </w:r>
-          </w:p>
-        </w:tc>
-        <w:tc>
-          <w:tcPr>
-            <w:tcW w:w="4968" w:type="dxa"/>
-            <w:vAlign w:val="center"/>
-          </w:tcPr>
-          <w:p>
-            <w:pPr>
-              <w:spacing w:after="0"/>
-            </w:pPr>
-            <w:r>
-              <w:rPr>
-                <w:sz w:val="19"/>
-              </w:rPr>
-              <w:t>Website property CRUD and property ID management.</w:t>
-            </w:r>
-          </w:p>
-        </w:tc>
-      </w:tr>
-      <w:tr>
-        <w:trPr>
-          <w:jc w:val="center"/>
-        </w:trPr>
-        <w:tc>
-          <w:tcPr>
-            <w:tcW w:w="4968" w:type="dxa"/>
-            <w:vAlign w:val="center"/>
-          </w:tcPr>
-          <w:p>
-            <w:pPr>
-              <w:spacing w:after="0"/>
-            </w:pPr>
-            <w:r>
-              <w:rPr>
-                <w:sz w:val="19"/>
-              </w:rPr>
-              <w:t>WebsiteAnalytics.DiagnosticsForm.pas/.fmx</w:t>
-            </w:r>
-          </w:p>
-        </w:tc>
-        <w:tc>
-          <w:tcPr>
-            <w:tcW w:w="4968" w:type="dxa"/>
-            <w:vAlign w:val="center"/>
-          </w:tcPr>
-          <w:p>
-            <w:pPr>
-              <w:spacing w:after="0"/>
-            </w:pPr>
-            <w:r>
-              <w:rPr>
-                <w:sz w:val="19"/>
-              </w:rPr>
-              <w:t>Diagnostics and self-test surface.</w:t>
-            </w:r>
-          </w:p>
-        </w:tc>
-      </w:tr>
-      <w:tr>
-        <w:trPr>
-          <w:jc w:val="center"/>
-        </w:trPr>
-        <w:tc>
-          <w:tcPr>
-            <w:tcW w:w="4968" w:type="dxa"/>
-            <w:vAlign w:val="center"/>
-          </w:tcPr>
-          <w:p>
-            <w:pPr>
-              <w:spacing w:after="0"/>
-            </w:pPr>
-            <w:r>
-              <w:rPr>
-                <w:sz w:val="19"/>
-              </w:rPr>
               <w:t>WebsiteAnalytics.Models.pas</w:t>
             </w:r>
           </w:p>
         </w:tc>
         <w:tc>
           <w:tcPr>
-            <w:tcW w:w="4968" w:type="dxa"/>
-            <w:vAlign w:val="center"/>
+            <w:tcW w:w="3360" w:type="dxa"/>
           </w:tcPr>
           <w:p>
-            <w:pPr>
-              <w:spacing w:after="0"/>
-            </w:pPr>
             <w:r>
-              <w:rPr>
-                <w:sz w:val="19"/>
-              </w:rPr>
-              <w:t>Shared record/class models for GA4 rows and snapshots.</w:t>
+              <w:t>Snapshots, KPI summaries, trend points, location/content rows.</w:t>
             </w:r>
           </w:p>
         </w:tc>
@@ -1322,224 +955,24 @@
       <w:pPr>
         <w:pStyle w:val="Heading1"/>
       </w:pPr>
-      <w:bookmarkStart w:id="3" w:name="_Toc235707713"/>
+      <w:bookmarkStart w:id="2" w:name="_Toc235732561"/>
       <w:r>
-        <w:t>Runtime data model</w:t>
+        <w:lastRenderedPageBreak/>
+        <w:t>Current Dashboard Surface</w:t>
       </w:r>
-      <w:bookmarkEnd w:id="3"/>
-    </w:p>
-    <w:p>
-      <w:r>
-        <w:t>The app separates persistent settings from transient analytics data. GA4 results are assembled into an in-memory snapshot and used to populate the dashboard. Closing the application discards those report rows.</w:t>
-      </w:r>
+      <w:bookmarkEnd w:id="2"/>
     </w:p>
     <w:p>
       <w:pPr>
-        <w:pStyle w:val="ListBullet"/>
+        <w:jc w:val="center"/>
       </w:pPr>
-      <w:r>
-        <w:t>Persistent: website_properties, app_settings, OAuth setup values, saved grid widths, encrypted refresh token.</w:t>
-      </w:r>
-    </w:p>
-    <w:p>
-      <w:pPr>
-        <w:pStyle w:val="ListBullet"/>
-      </w:pPr>
-      <w:r>
-        <w:t>Transient: KPI summaries, trend points, geography rows, content rows, realtime rows, chart data, status messages.</w:t>
-      </w:r>
-    </w:p>
-    <w:p>
-      <w:pPr>
-        <w:pStyle w:val="Heading1"/>
-      </w:pPr>
-      <w:bookmarkStart w:id="4" w:name="_Toc235707714"/>
-      <w:r>
-        <w:t>SQLite schema and public repository policy</w:t>
-      </w:r>
-      <w:bookmarkEnd w:id="4"/>
-    </w:p>
-    <w:p>
-      <w:r>
-        <w:t>The schema file is tracked so a clean checkout can create its local database. The generated database file is ignored.</w:t>
-      </w:r>
-    </w:p>
-    <w:tbl>
-      <w:tblPr>
-        <w:tblStyle w:val="TableGrid"/>
-        <w:tblW w:w="0" w:type="auto"/>
-        <w:jc w:val="center"/>
-        <w:tblLook w:val="04A0" w:firstRow="1" w:lastRow="0" w:firstColumn="1" w:lastColumn="0" w:noHBand="0" w:noVBand="1"/>
-      </w:tblPr>
-      <w:tblGrid>
-        <w:gridCol w:w="4968"/>
-        <w:gridCol w:w="4968"/>
-      </w:tblGrid>
-      <w:tr>
-        <w:trPr>
-          <w:jc w:val="center"/>
-        </w:trPr>
-        <w:tc>
-          <w:tcPr>
-            <w:tcW w:w="4968" w:type="dxa"/>
-            <w:shd w:val="clear" w:color="auto" w:fill="E8EEF5"/>
-            <w:vAlign w:val="center"/>
-          </w:tcPr>
-          <w:p>
-            <w:pPr>
-              <w:spacing w:after="0"/>
-            </w:pPr>
-            <w:r>
-              <w:rPr>
-                <w:b/>
-                <w:sz w:val="19"/>
-              </w:rPr>
-              <w:t>Table</w:t>
-            </w:r>
-          </w:p>
-        </w:tc>
-        <w:tc>
-          <w:tcPr>
-            <w:tcW w:w="4968" w:type="dxa"/>
-            <w:shd w:val="clear" w:color="auto" w:fill="E8EEF5"/>
-            <w:vAlign w:val="center"/>
-          </w:tcPr>
-          <w:p>
-            <w:pPr>
-              <w:spacing w:after="0"/>
-            </w:pPr>
-            <w:r>
-              <w:rPr>
-                <w:b/>
-                <w:sz w:val="19"/>
-              </w:rPr>
-              <w:t>Important columns</w:t>
-            </w:r>
-          </w:p>
-        </w:tc>
-      </w:tr>
-      <w:tr>
-        <w:trPr>
-          <w:jc w:val="center"/>
-        </w:trPr>
-        <w:tc>
-          <w:tcPr>
-            <w:tcW w:w="4968" w:type="dxa"/>
-            <w:vAlign w:val="center"/>
-          </w:tcPr>
-          <w:p>
-            <w:pPr>
-              <w:spacing w:after="0"/>
-            </w:pPr>
-            <w:r>
-              <w:rPr>
-                <w:sz w:val="19"/>
-              </w:rPr>
-              <w:t>app_settings</w:t>
-            </w:r>
-          </w:p>
-        </w:tc>
-        <w:tc>
-          <w:tcPr>
-            <w:tcW w:w="4968" w:type="dxa"/>
-            <w:vAlign w:val="center"/>
-          </w:tcPr>
-          <w:p>
-            <w:pPr>
-              <w:spacing w:after="0"/>
-            </w:pPr>
-            <w:r>
-              <w:rPr>
-                <w:sz w:val="19"/>
-              </w:rPr>
-              <w:t>setting_name, setting_value, setting_group, description, updated_utc</w:t>
-            </w:r>
-          </w:p>
-        </w:tc>
-      </w:tr>
-      <w:tr>
-        <w:trPr>
-          <w:jc w:val="center"/>
-        </w:trPr>
-        <w:tc>
-          <w:tcPr>
-            <w:tcW w:w="4968" w:type="dxa"/>
-            <w:vAlign w:val="center"/>
-          </w:tcPr>
-          <w:p>
-            <w:pPr>
-              <w:spacing w:after="0"/>
-            </w:pPr>
-            <w:r>
-              <w:rPr>
-                <w:sz w:val="19"/>
-              </w:rPr>
-              <w:t>website_properties</w:t>
-            </w:r>
-          </w:p>
-        </w:tc>
-        <w:tc>
-          <w:tcPr>
-            <w:tcW w:w="4968" w:type="dxa"/>
-            <w:vAlign w:val="center"/>
-          </w:tcPr>
-          <w:p>
-            <w:pPr>
-              <w:spacing w:after="0"/>
-            </w:pPr>
-            <w:r>
-              <w:rPr>
-                <w:sz w:val="19"/>
-              </w:rPr>
-              <w:t>display_name, website_address, ga4_property_id, display_color, enabled, display_order</w:t>
-            </w:r>
-          </w:p>
-        </w:tc>
-      </w:tr>
-    </w:tbl>
-    <w:p>
-      <w:pPr>
-        <w:pStyle w:val="ListBullet"/>
-      </w:pPr>
-      <w:r>
-        <w:t>databases/WebsiteAnalytics.schema.sql may be tracked.</w:t>
-      </w:r>
-    </w:p>
-    <w:p>
-      <w:pPr>
-        <w:pStyle w:val="ListBullet"/>
-      </w:pPr>
-      <w:r>
-        <w:t>databases/*.sqlite3 must be ignored.</w:t>
-      </w:r>
-    </w:p>
-    <w:p>
-      <w:pPr>
-        <w:pStyle w:val="ListBullet"/>
-      </w:pPr>
-      <w:r>
-        <w:t>Before public release, replace any maintainer-specific default property IDs with placeholders, sample IDs, or documented demo values as appropriate.</w:t>
-      </w:r>
-    </w:p>
-    <w:p>
-      <w:pPr>
-        <w:pStyle w:val="Heading1"/>
-      </w:pPr>
-      <w:bookmarkStart w:id="5" w:name="_Toc235707715"/>
-      <w:r>
-        <w:lastRenderedPageBreak/>
-        <w:t>Authentication design</w:t>
-      </w:r>
-      <w:bookmarkEnd w:id="5"/>
-    </w:p>
-    <w:p>
       <w:r>
         <w:rPr>
           <w:noProof/>
         </w:rPr>
         <w:drawing>
-          <wp:inline distT="0" distB="0" distL="0" distR="0" wp14:anchorId="4CD1736B" wp14:editId="1A45BDCB">
-            <wp:extent cx="6035040" cy="2256580"/>
+          <wp:inline distT="0" distB="0" distL="0" distR="0" wp14:anchorId="6FAF3C3A" wp14:editId="30A67794">
+            <wp:extent cx="5852160" cy="3474720"/>
             <wp:effectExtent l="0" t="0" r="0" b="0"/>
             <wp:docPr id="1" name="Picture 1"/>
             <wp:cNvGraphicFramePr>
@@ -1549,7 +982,7 @@
               <a:graphicData uri="http://schemas.openxmlformats.org/drawingml/2006/picture">
                 <pic:pic xmlns:pic="http://schemas.openxmlformats.org/drawingml/2006/picture">
                   <pic:nvPicPr>
-                    <pic:cNvPr id="0" name="public-oauth-flow.png"/>
+                    <pic:cNvPr id="0" name="dashboard-overview-sanitized.png"/>
                     <pic:cNvPicPr/>
                   </pic:nvPicPr>
                   <pic:blipFill>
@@ -1561,7 +994,7 @@
                   <pic:spPr>
                     <a:xfrm>
                       <a:off x="0" y="0"/>
-                      <a:ext cx="6035040" cy="2256580"/>
+                      <a:ext cx="5852160" cy="3474720"/>
                     </a:xfrm>
                     <a:prstGeom prst="rect">
                       <a:avLst/>
@@ -1581,15 +1014,28 @@
       <w:r>
         <w:rPr>
           <w:i/>
-          <w:color w:val="5A5A5A"/>
+          <w:color w:val="64748B"/>
           <w:sz w:val="18"/>
         </w:rPr>
-        <w:t>OAuth architecture for public users.</w:t>
+        <w:t>Current surface area with sanitized data.</w:t>
       </w:r>
     </w:p>
     <w:p>
+      <w:pPr>
+        <w:pStyle w:val="Heading1"/>
+      </w:pPr>
+      <w:bookmarkStart w:id="3" w:name="_Toc235732562"/>
       <w:r>
-        <w:t>Authentication uses Google OAuth for installed/desktop applications. The app starts a local loopback listener, opens the user browser, receives the authorization code, exchanges it for tokens, and stores the refresh token encrypted with Windows DPAPI. The access token remains in memory.</w:t>
+        <w:t>GA4 Reports Used</w:t>
+      </w:r>
+      <w:bookmarkEnd w:id="3"/>
+    </w:p>
+    <w:p>
+      <w:pPr>
+        <w:pStyle w:val="ListBullet"/>
+      </w:pPr>
+      <w:r>
+        <w:t>Overview/KPI requests include users, sessions, screen/page views, engagement rate, event count, events per session, and scrolled users.</w:t>
       </w:r>
     </w:p>
     <w:p>
@@ -1597,7 +1043,7 @@
         <w:pStyle w:val="ListBullet"/>
       </w:pPr>
       <w:r>
-        <w:t>Scope: https://www.googleapis.com/auth/analytics.readonly.</w:t>
+        <w:t>Trend requests normalize missing dates so the chart can show a complete selected range.</w:t>
       </w:r>
     </w:p>
     <w:p>
@@ -1605,7 +1051,7 @@
         <w:pStyle w:val="ListBullet"/>
       </w:pPr>
       <w:r>
-        <w:t>Client ID and secret are user-provided settings, not repository secrets.</w:t>
+        <w:t>Geography requests group country, region, city, users, sessions, and engagement information.</w:t>
       </w:r>
     </w:p>
     <w:p>
@@ -1613,7 +1059,7 @@
         <w:pStyle w:val="ListBullet"/>
       </w:pPr>
       <w:r>
-        <w:t>Refresh token setting: ga4_oauth_refresh_token_dpapi.</w:t>
+        <w:t>Content requests group page title, path, action/event, users, and event/download counts.</w:t>
       </w:r>
     </w:p>
     <w:p>
@@ -1621,401 +1067,36 @@
         <w:pStyle w:val="ListBullet"/>
       </w:pPr>
       <w:r>
-        <w:t>Silent startup reconnect decrypts the saved refresh token for the current Windows account and refreshes the access token.</w:t>
-      </w:r>
-    </w:p>
-    <w:p>
-      <w:pPr>
-        <w:pStyle w:val="ListBullet"/>
-      </w:pPr>
-      <w:r>
-        <w:t>If refresh fails, the app falls back to interactive Google connection from Settings.</w:t>
+        <w:t>Realtime requests read active users, realtime views, and the current/last activity location when GA4 returns those dimensions.</w:t>
       </w:r>
     </w:p>
     <w:p>
       <w:pPr>
         <w:pStyle w:val="Heading1"/>
       </w:pPr>
-      <w:bookmarkStart w:id="6" w:name="_Toc235707716"/>
+      <w:bookmarkStart w:id="4" w:name="_Toc235732563"/>
       <w:r>
-        <w:t>GA4 request design</w:t>
+        <w:t>Authentication and Token Storage</w:t>
       </w:r>
-      <w:bookmarkEnd w:id="6"/>
+      <w:bookmarkEnd w:id="4"/>
     </w:p>
     <w:p>
       <w:r>
-        <w:t>The GA4 data layer requests standard report rows for the selected property/date range and realtime rows for current activity. Reports should remain narrowly focused on the dashboard questions rather than attempting to mirror every GA4 screen.</w:t>
-      </w:r>
-    </w:p>
-    <w:tbl>
-      <w:tblPr>
-        <w:tblStyle w:val="TableGrid"/>
-        <w:tblW w:w="0" w:type="auto"/>
-        <w:jc w:val="center"/>
-        <w:tblLook w:val="04A0" w:firstRow="1" w:lastRow="0" w:firstColumn="1" w:lastColumn="0" w:noHBand="0" w:noVBand="1"/>
-      </w:tblPr>
-      <w:tblGrid>
-        <w:gridCol w:w="4968"/>
-        <w:gridCol w:w="4968"/>
-      </w:tblGrid>
-      <w:tr>
-        <w:trPr>
-          <w:jc w:val="center"/>
-        </w:trPr>
-        <w:tc>
-          <w:tcPr>
-            <w:tcW w:w="4968" w:type="dxa"/>
-            <w:shd w:val="clear" w:color="auto" w:fill="E8EEF5"/>
-            <w:vAlign w:val="center"/>
-          </w:tcPr>
-          <w:p>
-            <w:pPr>
-              <w:spacing w:after="0"/>
-            </w:pPr>
-            <w:r>
-              <w:rPr>
-                <w:b/>
-                <w:sz w:val="19"/>
-              </w:rPr>
-              <w:t>Dashboard area</w:t>
-            </w:r>
-          </w:p>
-        </w:tc>
-        <w:tc>
-          <w:tcPr>
-            <w:tcW w:w="4968" w:type="dxa"/>
-            <w:shd w:val="clear" w:color="auto" w:fill="E8EEF5"/>
-            <w:vAlign w:val="center"/>
-          </w:tcPr>
-          <w:p>
-            <w:pPr>
-              <w:spacing w:after="0"/>
-            </w:pPr>
-            <w:r>
-              <w:rPr>
-                <w:b/>
-                <w:sz w:val="19"/>
-              </w:rPr>
-              <w:t>Typical GA4 dimensions/metrics</w:t>
-            </w:r>
-          </w:p>
-        </w:tc>
-      </w:tr>
-      <w:tr>
-        <w:trPr>
-          <w:jc w:val="center"/>
-        </w:trPr>
-        <w:tc>
-          <w:tcPr>
-            <w:tcW w:w="4968" w:type="dxa"/>
-            <w:vAlign w:val="center"/>
-          </w:tcPr>
-          <w:p>
-            <w:pPr>
-              <w:spacing w:after="0"/>
-            </w:pPr>
-            <w:r>
-              <w:rPr>
-                <w:sz w:val="19"/>
-              </w:rPr>
-              <w:t>Locations</w:t>
-            </w:r>
-          </w:p>
-        </w:tc>
-        <w:tc>
-          <w:tcPr>
-            <w:tcW w:w="4968" w:type="dxa"/>
-            <w:vAlign w:val="center"/>
-          </w:tcPr>
-          <w:p>
-            <w:pPr>
-              <w:spacing w:after="0"/>
-            </w:pPr>
-            <w:r>
-              <w:rPr>
-                <w:sz w:val="19"/>
-              </w:rPr>
-              <w:t>country, region, city; activeUsers, sessions</w:t>
-            </w:r>
-          </w:p>
-        </w:tc>
-      </w:tr>
-      <w:tr>
-        <w:trPr>
-          <w:jc w:val="center"/>
-        </w:trPr>
-        <w:tc>
-          <w:tcPr>
-            <w:tcW w:w="4968" w:type="dxa"/>
-            <w:vAlign w:val="center"/>
-          </w:tcPr>
-          <w:p>
-            <w:pPr>
-              <w:spacing w:after="0"/>
-            </w:pPr>
-            <w:r>
-              <w:rPr>
-                <w:sz w:val="19"/>
-              </w:rPr>
-              <w:t>Pages/downloads</w:t>
-            </w:r>
-          </w:p>
-        </w:tc>
-        <w:tc>
-          <w:tcPr>
-            <w:tcW w:w="4968" w:type="dxa"/>
-            <w:vAlign w:val="center"/>
-          </w:tcPr>
-          <w:p>
-            <w:pPr>
-              <w:spacing w:after="0"/>
-            </w:pPr>
-            <w:r>
-              <w:rPr>
-                <w:sz w:val="19"/>
-              </w:rPr>
-              <w:t>pageTitle, pagePath, eventName; activeUsers, eventCount</w:t>
-            </w:r>
-          </w:p>
-        </w:tc>
-      </w:tr>
-      <w:tr>
-        <w:trPr>
-          <w:jc w:val="center"/>
-        </w:trPr>
-        <w:tc>
-          <w:tcPr>
-            <w:tcW w:w="4968" w:type="dxa"/>
-            <w:vAlign w:val="center"/>
-          </w:tcPr>
-          <w:p>
-            <w:pPr>
-              <w:spacing w:after="0"/>
-            </w:pPr>
-            <w:r>
-              <w:rPr>
-                <w:sz w:val="19"/>
-              </w:rPr>
-              <w:t>Users over range</w:t>
-            </w:r>
-          </w:p>
-        </w:tc>
-        <w:tc>
-          <w:tcPr>
-            <w:tcW w:w="4968" w:type="dxa"/>
-            <w:vAlign w:val="center"/>
-          </w:tcPr>
-          <w:p>
-            <w:pPr>
-              <w:spacing w:after="0"/>
-            </w:pPr>
-            <w:r>
-              <w:rPr>
-                <w:sz w:val="19"/>
-              </w:rPr>
-              <w:t>date; activeUsers</w:t>
-            </w:r>
-          </w:p>
-        </w:tc>
-      </w:tr>
-      <w:tr>
-        <w:trPr>
-          <w:jc w:val="center"/>
-        </w:trPr>
-        <w:tc>
-          <w:tcPr>
-            <w:tcW w:w="4968" w:type="dxa"/>
-            <w:vAlign w:val="center"/>
-          </w:tcPr>
-          <w:p>
-            <w:pPr>
-              <w:spacing w:after="0"/>
-            </w:pPr>
-            <w:r>
-              <w:rPr>
-                <w:sz w:val="19"/>
-              </w:rPr>
-              <w:t>Realtime</w:t>
-            </w:r>
-          </w:p>
-        </w:tc>
-        <w:tc>
-          <w:tcPr>
-            <w:tcW w:w="4968" w:type="dxa"/>
-            <w:vAlign w:val="center"/>
-          </w:tcPr>
-          <w:p>
-            <w:pPr>
-              <w:spacing w:after="0"/>
-            </w:pPr>
-            <w:r>
-              <w:rPr>
-                <w:sz w:val="19"/>
-              </w:rPr>
-              <w:t>city, country or region; activeUsers and recent activity fields where available</w:t>
-            </w:r>
-          </w:p>
-        </w:tc>
-      </w:tr>
-      <w:tr>
-        <w:trPr>
-          <w:jc w:val="center"/>
-        </w:trPr>
-        <w:tc>
-          <w:tcPr>
-            <w:tcW w:w="4968" w:type="dxa"/>
-            <w:vAlign w:val="center"/>
-          </w:tcPr>
-          <w:p>
-            <w:pPr>
-              <w:spacing w:after="0"/>
-            </w:pPr>
-            <w:r>
-              <w:rPr>
-                <w:sz w:val="19"/>
-              </w:rPr>
-              <w:t>Summary cards</w:t>
-            </w:r>
-          </w:p>
-        </w:tc>
-        <w:tc>
-          <w:tcPr>
-            <w:tcW w:w="4968" w:type="dxa"/>
-            <w:vAlign w:val="center"/>
-          </w:tcPr>
-          <w:p>
-            <w:pPr>
-              <w:spacing w:after="0"/>
-            </w:pPr>
-            <w:r>
-              <w:rPr>
-                <w:sz w:val="19"/>
-              </w:rPr>
-              <w:t>aggregated users, views, events/downloads, top page, realtime counts</w:t>
-            </w:r>
-          </w:p>
-        </w:tc>
-      </w:tr>
-    </w:tbl>
-    <w:p>
-      <w:pPr>
-        <w:pStyle w:val="Heading1"/>
-      </w:pPr>
-      <w:bookmarkStart w:id="7" w:name="_Toc235707717"/>
-      <w:r>
-        <w:t>UI engineering notes</w:t>
-      </w:r>
-      <w:bookmarkEnd w:id="7"/>
-    </w:p>
-    <w:p>
-      <w:pPr>
-        <w:pStyle w:val="ListBullet"/>
-      </w:pPr>
-      <w:r>
-        <w:t>The main form is FMX and should remain editable in the Object Inspector.</w:t>
+        <w:t>The app uses a Google desktop OAuth client. On first sign-in the loopback listener receives an authorization code, exchanges it for tokens, and stores the refresh token encrypted for the current Windows user. Startup attempts a silent token refresh before showing any browser login screens.</w:t>
       </w:r>
     </w:p>
     <w:p>
       <w:pPr>
-        <w:pStyle w:val="ListBullet"/>
+        <w:jc w:val="center"/>
       </w:pPr>
-      <w:r>
-        <w:t>When layout behavior truly requires code, keep it narrow, explain why, and avoid unnecessary helper code.</w:t>
-      </w:r>
-    </w:p>
-    <w:p>
-      <w:pPr>
-        <w:pStyle w:val="ListBullet"/>
-      </w:pPr>
-      <w:r>
-        <w:t>Charts are custom painted and support hover tooltips for exact values.</w:t>
-      </w:r>
-    </w:p>
-    <w:p>
-      <w:pPr>
-        <w:pStyle w:val="ListBullet"/>
-      </w:pPr>
-      <w:r>
-        <w:t>Grids persist user-adjusted column widths through settings.</w:t>
-      </w:r>
-    </w:p>
-    <w:p>
-      <w:pPr>
-        <w:pStyle w:val="ListBullet"/>
-      </w:pPr>
-      <w:r>
-        <w:lastRenderedPageBreak/>
-        <w:t>The UI should remain reasonably resizable for common desktop resolutions.</w:t>
-      </w:r>
-    </w:p>
-    <w:p>
-      <w:pPr>
-        <w:pStyle w:val="Heading1"/>
-      </w:pPr>
-      <w:bookmarkStart w:id="8" w:name="_Toc235707718"/>
-      <w:r>
-        <w:t>Build and smoke test</w:t>
-      </w:r>
-      <w:bookmarkEnd w:id="8"/>
-    </w:p>
-    <w:p>
-      <w:pPr>
-        <w:pStyle w:val="ListNumber"/>
-      </w:pPr>
-      <w:r>
-        <w:t>Open a RAD Studio command prompt or call rsvars.bat from C:\Program Files (x86)\Embarcadero\Studio\37.0\bin, adjusted for the public user's installed version.</w:t>
-      </w:r>
-    </w:p>
-    <w:p>
-      <w:pPr>
-        <w:pStyle w:val="ListNumber"/>
-      </w:pPr>
-      <w:r>
-        <w:t>Build Win64 Debug with msbuild WebsiteAnalytics.dproj /t:Build /p:Config=Debug /p:Platform=Win64.</w:t>
-      </w:r>
-    </w:p>
-    <w:p>
-      <w:pPr>
-        <w:pStyle w:val="ListNumber"/>
-      </w:pPr>
-      <w:r>
-        <w:t>Build Win32 Debug if that target is supported.</w:t>
-      </w:r>
-    </w:p>
-    <w:p>
-      <w:pPr>
-        <w:pStyle w:val="ListNumber"/>
-      </w:pPr>
-      <w:r>
-        <w:t>Smoke-test startup with -no-startup-auth so the form loads without forcing Google sign-in.</w:t>
-      </w:r>
-    </w:p>
-    <w:p>
-      <w:pPr>
-        <w:pStyle w:val="ListNumber"/>
-      </w:pPr>
-      <w:r>
-        <w:t>Verify no FMX streaming errors such as missing properties or invalid property values.</w:t>
-      </w:r>
-    </w:p>
-    <w:p>
-      <w:pPr>
-        <w:pStyle w:val="Heading1"/>
-      </w:pPr>
-      <w:bookmarkStart w:id="9" w:name="_Toc235707719"/>
-      <w:r>
-        <w:t>Open-source hardening checklist</w:t>
-      </w:r>
-      <w:bookmarkEnd w:id="9"/>
-    </w:p>
-    <w:p>
       <w:r>
         <w:rPr>
           <w:noProof/>
         </w:rPr>
+        <w:lastRenderedPageBreak/>
         <w:drawing>
-          <wp:inline distT="0" distB="0" distL="0" distR="0" wp14:anchorId="008EDA22" wp14:editId="03530579">
-            <wp:extent cx="6035040" cy="2309059"/>
+          <wp:inline distT="0" distB="0" distL="0" distR="0" wp14:anchorId="7D464200" wp14:editId="0B5F0705">
+            <wp:extent cx="5577840" cy="3155883"/>
             <wp:effectExtent l="0" t="0" r="0" b="0"/>
             <wp:docPr id="2" name="Picture 2"/>
             <wp:cNvGraphicFramePr>
@@ -2025,7 +1106,7 @@
               <a:graphicData uri="http://schemas.openxmlformats.org/drawingml/2006/picture">
                 <pic:pic xmlns:pic="http://schemas.openxmlformats.org/drawingml/2006/picture">
                   <pic:nvPicPr>
-                    <pic:cNvPr id="0" name="public-repo-safety.png"/>
+                    <pic:cNvPr id="0" name="settings-redacted-clean.png"/>
                     <pic:cNvPicPr/>
                   </pic:nvPicPr>
                   <pic:blipFill>
@@ -2037,7 +1118,7 @@
                   <pic:spPr>
                     <a:xfrm>
                       <a:off x="0" y="0"/>
-                      <a:ext cx="6035040" cy="2309059"/>
+                      <a:ext cx="5577840" cy="3155883"/>
                     </a:xfrm>
                     <a:prstGeom prst="rect">
                       <a:avLst/>
@@ -2057,10 +1138,101 @@
       <w:r>
         <w:rPr>
           <w:i/>
-          <w:color w:val="5A5A5A"/>
+          <w:color w:val="64748B"/>
           <w:sz w:val="18"/>
         </w:rPr>
-        <w:t>Repository safety checklist for maintainers.</w:t>
+        <w:t>OAuth settings are shown with dummy values and a hidden client secret.</w:t>
+      </w:r>
+    </w:p>
+    <w:p>
+      <w:pPr>
+        <w:pStyle w:val="Heading1"/>
+      </w:pPr>
+      <w:bookmarkStart w:id="5" w:name="_Toc235732564"/>
+      <w:r>
+        <w:t>Portable SQLite Settings</w:t>
+      </w:r>
+      <w:bookmarkEnd w:id="5"/>
+    </w:p>
+    <w:p>
+      <w:r>
+        <w:t>The SQLite database stores application settings, property definitions, saved grid widths, OAuth setup values, and the encrypted refresh token. Report data remains memory-only.</w:t>
+      </w:r>
+    </w:p>
+    <w:p>
+      <w:pPr>
+        <w:jc w:val="center"/>
+      </w:pPr>
+      <w:r>
+        <w:rPr>
+          <w:noProof/>
+        </w:rPr>
+        <w:drawing>
+          <wp:inline distT="0" distB="0" distL="0" distR="0" wp14:anchorId="579CF899" wp14:editId="3BF9DEBF">
+            <wp:extent cx="5577840" cy="2642135"/>
+            <wp:effectExtent l="0" t="0" r="0" b="0"/>
+            <wp:docPr id="3" name="Picture 3"/>
+            <wp:cNvGraphicFramePr>
+              <a:graphicFrameLocks xmlns:a="http://schemas.openxmlformats.org/drawingml/2006/main" noChangeAspect="1"/>
+            </wp:cNvGraphicFramePr>
+            <a:graphic xmlns:a="http://schemas.openxmlformats.org/drawingml/2006/main">
+              <a:graphicData uri="http://schemas.openxmlformats.org/drawingml/2006/picture">
+                <pic:pic xmlns:pic="http://schemas.openxmlformats.org/drawingml/2006/picture">
+                  <pic:nvPicPr>
+                    <pic:cNvPr id="0" name="privacy-storage-clean.png"/>
+                    <pic:cNvPicPr/>
+                  </pic:nvPicPr>
+                  <pic:blipFill>
+                    <a:blip r:embed="rId8"/>
+                    <a:stretch>
+                      <a:fillRect/>
+                    </a:stretch>
+                  </pic:blipFill>
+                  <pic:spPr>
+                    <a:xfrm>
+                      <a:off x="0" y="0"/>
+                      <a:ext cx="5577840" cy="2642135"/>
+                    </a:xfrm>
+                    <a:prstGeom prst="rect">
+                      <a:avLst/>
+                    </a:prstGeom>
+                  </pic:spPr>
+                </pic:pic>
+              </a:graphicData>
+            </a:graphic>
+          </wp:inline>
+        </w:drawing>
+      </w:r>
+    </w:p>
+    <w:p>
+      <w:pPr>
+        <w:jc w:val="center"/>
+      </w:pPr>
+      <w:r>
+        <w:rPr>
+          <w:i/>
+          <w:color w:val="64748B"/>
+          <w:sz w:val="18"/>
+        </w:rPr>
+        <w:t>Storage responsibilities and Git tracking policy.</w:t>
+      </w:r>
+    </w:p>
+    <w:p>
+      <w:pPr>
+        <w:pStyle w:val="Heading1"/>
+      </w:pPr>
+      <w:bookmarkStart w:id="6" w:name="_Toc235732565"/>
+      <w:r>
+        <w:t>Designer/Editability Rules</w:t>
+      </w:r>
+      <w:bookmarkEnd w:id="6"/>
+    </w:p>
+    <w:p>
+      <w:pPr>
+        <w:pStyle w:val="ListBullet"/>
+      </w:pPr>
+      <w:r>
+        <w:t>FMX forms should remain editable in RAD Studio.</w:t>
       </w:r>
     </w:p>
     <w:p>
@@ -2068,7 +1240,7 @@
         <w:pStyle w:val="ListBullet"/>
       </w:pPr>
       <w:r>
-        <w:t>Review .gitignore before public release.</w:t>
+        <w:t>Do not add helper code or runtime UI layout code without developer approval.</w:t>
       </w:r>
     </w:p>
     <w:p>
@@ -2076,7 +1248,7 @@
         <w:pStyle w:val="ListBullet"/>
       </w:pPr>
       <w:r>
-        <w:t>Search for OAuth secrets, refresh tokens, sqlite files, credential JSON, personal folders, and private URLs.</w:t>
+        <w:t>Prefer Object Inspector settings for control placement and sizing whenever practical.</w:t>
       </w:r>
     </w:p>
     <w:p>
@@ -2084,7 +1256,76 @@
         <w:pStyle w:val="ListBullet"/>
       </w:pPr>
       <w:r>
-        <w:t>Use a clean public repository if private history ever contained secrets.</w:t>
+        <w:lastRenderedPageBreak/>
+        <w:t>When runtime drawing is necessary for charts or tooltips, keep it limited to painting/data display, not form construction.</w:t>
+      </w:r>
+    </w:p>
+    <w:p>
+      <w:pPr>
+        <w:pStyle w:val="Heading1"/>
+      </w:pPr>
+      <w:bookmarkStart w:id="7" w:name="_Toc235732566"/>
+      <w:r>
+        <w:t>Build and Validation</w:t>
+      </w:r>
+      <w:bookmarkEnd w:id="7"/>
+    </w:p>
+    <w:p>
+      <w:pPr>
+        <w:pStyle w:val="ListNumber"/>
+      </w:pPr>
+      <w:r>
+        <w:t>Create a pre-change backup on D: before modifying project files.</w:t>
+      </w:r>
+    </w:p>
+    <w:p>
+      <w:pPr>
+        <w:pStyle w:val="ListNumber"/>
+      </w:pPr>
+      <w:r>
+        <w:t>Build Win64 and Win32 Debug with RAD Studio 37.0 MSBuild.</w:t>
+      </w:r>
+    </w:p>
+    <w:p>
+      <w:pPr>
+        <w:pStyle w:val="ListNumber"/>
+      </w:pPr>
+      <w:r>
+        <w:t>Smoke-test startup to catch FMX read errors.</w:t>
+      </w:r>
+    </w:p>
+    <w:p>
+      <w:pPr>
+        <w:pStyle w:val="ListNumber"/>
+      </w:pPr>
+      <w:r>
+        <w:t>Review Git status and stage only intended files.</w:t>
+      </w:r>
+    </w:p>
+    <w:p>
+      <w:pPr>
+        <w:pStyle w:val="ListNumber"/>
+      </w:pPr>
+      <w:r>
+        <w:t>Commit and push both the private and public repositories when the change is complete.</w:t>
+      </w:r>
+    </w:p>
+    <w:p>
+      <w:pPr>
+        <w:pStyle w:val="Heading1"/>
+      </w:pPr>
+      <w:bookmarkStart w:id="8" w:name="_Toc235732567"/>
+      <w:r>
+        <w:t>Public Repository Hygiene</w:t>
+      </w:r>
+      <w:bookmarkEnd w:id="8"/>
+    </w:p>
+    <w:p>
+      <w:pPr>
+        <w:pStyle w:val="ListBullet"/>
+      </w:pPr>
+      <w:r>
+        <w:t>Never commit a real SQLite database, OAuth client secret, refresh token, or personal property IDs.</w:t>
       </w:r>
     </w:p>
     <w:p>
@@ -2092,7 +1333,7 @@
         <w:pStyle w:val="ListBullet"/>
       </w:pPr>
       <w:r>
-        <w:t>Do not commit screenshots showing unredacted secrets.</w:t>
+        <w:t>Keep databases/WebsiteAnalytics.schema.sql tracked.</w:t>
       </w:r>
     </w:p>
     <w:p>
@@ -2100,92 +1341,7 @@
         <w:pStyle w:val="ListBullet"/>
       </w:pPr>
       <w:r>
-        <w:t>Use placeholders in docs: YOUR_OAUTH_CLIENT_ID, YOUR_OAUTH_CLIENT_SECRET, YOUR_GA4_PROPERTY_ID, and https://github.com/&lt;your-user&gt;/&lt;repo&gt;.</w:t>
-      </w:r>
-    </w:p>
-    <w:p>
-      <w:pPr>
-        <w:pStyle w:val="Heading1"/>
-      </w:pPr>
-      <w:bookmarkStart w:id="10" w:name="_Toc235707720"/>
-      <w:r>
-        <w:t>Contribution workflow</w:t>
-      </w:r>
-      <w:bookmarkEnd w:id="10"/>
-    </w:p>
-    <w:p>
-      <w:pPr>
-        <w:pStyle w:val="ListNumber"/>
-      </w:pPr>
-      <w:r>
-        <w:t>Create a branch for changes.</w:t>
-      </w:r>
-    </w:p>
-    <w:p>
-      <w:pPr>
-        <w:pStyle w:val="ListNumber"/>
-      </w:pPr>
-      <w:r>
-        <w:t>Make a pre-change backup when working under the maintainer's local directives.</w:t>
-      </w:r>
-    </w:p>
-    <w:p>
-      <w:pPr>
-        <w:pStyle w:val="ListNumber"/>
-      </w:pPr>
-      <w:r>
-        <w:t>Keep edits scoped.</w:t>
-      </w:r>
-    </w:p>
-    <w:p>
-      <w:pPr>
-        <w:pStyle w:val="ListNumber"/>
-      </w:pPr>
-      <w:r>
-        <w:t>Build and smoke-test.</w:t>
-      </w:r>
-    </w:p>
-    <w:p>
-      <w:pPr>
-        <w:pStyle w:val="ListNumber"/>
-      </w:pPr>
-      <w:r>
-        <w:t>Stage only intended files.</w:t>
-      </w:r>
-    </w:p>
-    <w:p>
-      <w:pPr>
-        <w:pStyle w:val="ListNumber"/>
-      </w:pPr>
-      <w:r>
-        <w:t>Commit with a clear message.</w:t>
-      </w:r>
-    </w:p>
-    <w:p>
-      <w:pPr>
-        <w:pStyle w:val="ListNumber"/>
-      </w:pPr>
-      <w:r>
-        <w:t>Push and open a pull request when the repository is public.</w:t>
-      </w:r>
-    </w:p>
-    <w:p>
-      <w:pPr>
-        <w:pStyle w:val="Heading1"/>
-      </w:pPr>
-      <w:bookmarkStart w:id="11" w:name="_Toc235707721"/>
-      <w:r>
-        <w:lastRenderedPageBreak/>
-        <w:t>Future extension points</w:t>
-      </w:r>
-      <w:bookmarkEnd w:id="11"/>
-    </w:p>
-    <w:p>
-      <w:pPr>
-        <w:pStyle w:val="ListBullet"/>
-      </w:pPr>
-      <w:r>
-        <w:t>Traffic sources/referrers.</w:t>
+        <w:t>Use dummy property IDs and redacted OAuth examples in documentation.</w:t>
       </w:r>
     </w:p>
     <w:p>
@@ -2193,36 +1349,70 @@
         <w:pStyle w:val="ListBullet"/>
       </w:pPr>
       <w:r>
-        <w:t>Devices, browsers, and operating systems.</w:t>
+        <w:t>Keep generated binaries and local build outputs ignored unless an explicit release artifact is being created.</w:t>
       </w:r>
     </w:p>
     <w:p>
       <w:pPr>
-        <w:pStyle w:val="ListBullet"/>
+        <w:jc w:val="center"/>
       </w:pPr>
       <w:r>
-        <w:t>Language/localization reports for worldwide users.</w:t>
+        <w:rPr>
+          <w:noProof/>
+        </w:rPr>
+        <w:drawing>
+          <wp:inline distT="0" distB="0" distL="0" distR="0" wp14:anchorId="7BE32511" wp14:editId="5411FBA7">
+            <wp:extent cx="5577840" cy="2568742"/>
+            <wp:effectExtent l="0" t="0" r="0" b="0"/>
+            <wp:docPr id="4" name="Picture 4"/>
+            <wp:cNvGraphicFramePr>
+              <a:graphicFrameLocks xmlns:a="http://schemas.openxmlformats.org/drawingml/2006/main" noChangeAspect="1"/>
+            </wp:cNvGraphicFramePr>
+            <a:graphic xmlns:a="http://schemas.openxmlformats.org/drawingml/2006/main">
+              <a:graphicData uri="http://schemas.openxmlformats.org/drawingml/2006/picture">
+                <pic:pic xmlns:pic="http://schemas.openxmlformats.org/drawingml/2006/picture">
+                  <pic:nvPicPr>
+                    <pic:cNvPr id="0" name="properties-redacted-clean.png"/>
+                    <pic:cNvPicPr/>
+                  </pic:nvPicPr>
+                  <pic:blipFill>
+                    <a:blip r:embed="rId9"/>
+                    <a:stretch>
+                      <a:fillRect/>
+                    </a:stretch>
+                  </pic:blipFill>
+                  <pic:spPr>
+                    <a:xfrm>
+                      <a:off x="0" y="0"/>
+                      <a:ext cx="5577840" cy="2568742"/>
+                    </a:xfrm>
+                    <a:prstGeom prst="rect">
+                      <a:avLst/>
+                    </a:prstGeom>
+                  </pic:spPr>
+                </pic:pic>
+              </a:graphicData>
+            </a:graphic>
+          </wp:inline>
+        </w:drawing>
       </w:r>
     </w:p>
     <w:p>
       <w:pPr>
-        <w:pStyle w:val="ListBullet"/>
+        <w:jc w:val="center"/>
       </w:pPr>
       <w:r>
-        <w:t>Data quality reporting for not-set locations and missing dimensions.</w:t>
-      </w:r>
-    </w:p>
-    <w:p>
-      <w:pPr>
-        <w:pStyle w:val="ListBullet"/>
-      </w:pPr>
-      <w:r>
-        <w:t>Optional exports, if the app later needs CSV/PDF reporting.</w:t>
+        <w:rPr>
+          <w:i/>
+          <w:color w:val="64748B"/>
+          <w:sz w:val="18"/>
+        </w:rPr>
+        <w:t>Sanitized property examples suitable for public documentation.</w:t>
       </w:r>
     </w:p>
     <w:sectPr>
       <w:pgSz w:w="12240" w:h="15840"/>
-      <w:pgMar w:top="1152" w:right="1152" w:bottom="1008" w:left="1152" w:header="720" w:footer="720" w:gutter="0"/>
+      <w:pgMar w:top="1080" w:right="1080" w:bottom="1080" w:left="1080" w:header="720" w:footer="720" w:gutter="0"/>
       <w:cols w:space="720"/>
       <w:docGrid w:linePitch="360"/>
     </w:sectPr>
@@ -2403,31 +1593,31 @@
       </w:rPr>
     </w:lvl>
   </w:abstractNum>
-  <w:num w:numId="1" w16cid:durableId="176358196">
+  <w:num w:numId="1" w16cid:durableId="595795204">
     <w:abstractNumId w:val="8"/>
   </w:num>
-  <w:num w:numId="2" w16cid:durableId="1384480372">
+  <w:num w:numId="2" w16cid:durableId="1199702193">
     <w:abstractNumId w:val="6"/>
   </w:num>
-  <w:num w:numId="3" w16cid:durableId="1443576448">
+  <w:num w:numId="3" w16cid:durableId="669674393">
     <w:abstractNumId w:val="5"/>
   </w:num>
-  <w:num w:numId="4" w16cid:durableId="1176071699">
+  <w:num w:numId="4" w16cid:durableId="1618369397">
     <w:abstractNumId w:val="4"/>
   </w:num>
-  <w:num w:numId="5" w16cid:durableId="988896376">
+  <w:num w:numId="5" w16cid:durableId="231894615">
     <w:abstractNumId w:val="7"/>
   </w:num>
-  <w:num w:numId="6" w16cid:durableId="1224372294">
+  <w:num w:numId="6" w16cid:durableId="1652439561">
     <w:abstractNumId w:val="3"/>
   </w:num>
-  <w:num w:numId="7" w16cid:durableId="1698583904">
+  <w:num w:numId="7" w16cid:durableId="1101952021">
     <w:abstractNumId w:val="2"/>
   </w:num>
-  <w:num w:numId="8" w16cid:durableId="812255465">
+  <w:num w:numId="8" w16cid:durableId="793671360">
     <w:abstractNumId w:val="1"/>
   </w:num>
-  <w:num w:numId="9" w16cid:durableId="1947348255">
+  <w:num w:numId="9" w16cid:durableId="1046443549">
     <w:abstractNumId w:val="0"/>
   </w:num>
 </w:numbering>
@@ -2842,15 +2032,15 @@
     <w:pPr>
       <w:keepNext/>
       <w:keepLines/>
-      <w:spacing w:before="480" w:after="0"/>
+      <w:spacing w:before="240"/>
       <w:outlineLvl w:val="0"/>
     </w:pPr>
     <w:rPr>
       <w:rFonts w:asciiTheme="majorHAnsi" w:eastAsiaTheme="majorEastAsia" w:hAnsiTheme="majorHAnsi" w:cstheme="majorBidi"/>
       <w:b/>
       <w:bCs/>
-      <w:color w:val="1F4E79"/>
-      <w:sz w:val="32"/>
+      <w:color w:val="0B2341"/>
+      <w:sz w:val="36"/>
       <w:szCs w:val="28"/>
     </w:rPr>
   </w:style>
@@ -2866,15 +2056,15 @@
     <w:pPr>
       <w:keepNext/>
       <w:keepLines/>
-      <w:spacing w:before="200" w:after="0"/>
+      <w:spacing w:before="240"/>
       <w:outlineLvl w:val="1"/>
     </w:pPr>
     <w:rPr>
       <w:rFonts w:asciiTheme="majorHAnsi" w:eastAsiaTheme="majorEastAsia" w:hAnsiTheme="majorHAnsi" w:cstheme="majorBidi"/>
       <w:b/>
       <w:bCs/>
-      <w:color w:val="1F4E79"/>
-      <w:sz w:val="26"/>
+      <w:color w:val="1974DF"/>
+      <w:sz w:val="28"/>
       <w:szCs w:val="26"/>
     </w:rPr>
   </w:style>
@@ -2890,14 +2080,14 @@
     <w:pPr>
       <w:keepNext/>
       <w:keepLines/>
-      <w:spacing w:before="200" w:after="0"/>
+      <w:spacing w:before="240"/>
       <w:outlineLvl w:val="2"/>
     </w:pPr>
     <w:rPr>
       <w:rFonts w:asciiTheme="majorHAnsi" w:eastAsiaTheme="majorEastAsia" w:hAnsiTheme="majorHAnsi" w:cstheme="majorBidi"/>
       <w:b/>
       <w:bCs/>
-      <w:color w:val="1F4E79"/>
+      <w:color w:val="1F4D78"/>
       <w:sz w:val="24"/>
     </w:rPr>
   </w:style>
@@ -13819,7 +13009,7 @@
     <w:autoRedefine/>
     <w:uiPriority w:val="39"/>
     <w:unhideWhenUsed/>
-    <w:rsid w:val="00DB1E24"/>
+    <w:rsid w:val="00082C3F"/>
     <w:pPr>
       <w:spacing w:after="100"/>
     </w:pPr>
@@ -13829,7 +13019,7 @@
     <w:basedOn w:val="DefaultParagraphFont"/>
     <w:uiPriority w:val="99"/>
     <w:unhideWhenUsed/>
-    <w:rsid w:val="00DB1E24"/>
+    <w:rsid w:val="00082C3F"/>
     <w:rPr>
       <w:color w:val="0000FF" w:themeColor="hyperlink"/>
       <w:u w:val="single"/>

</xml_diff>

<commit_message>
Rebuild documentation with sanitized real screenshots
</commit_message>
<xml_diff>
--- a/docs/guides/WebsiteAnalytics_Engineering_Guide.docx
+++ b/docs/guides/WebsiteAnalytics_Engineering_Guide.docx
@@ -24,10 +24,21 @@
           <w:color w:val="64748B"/>
           <w:sz w:val="24"/>
         </w:rPr>
-        <w:t>Website Analytics GA4 Dashboard • Last changed July 23, 2026</w:t>
+        <w:t>Implementation, maintenance, build, and public-repository notes</w:t>
       </w:r>
     </w:p>
-    <w:p/>
+    <w:p>
+      <w:pPr>
+        <w:jc w:val="center"/>
+      </w:pPr>
+      <w:r>
+        <w:rPr>
+          <w:color w:val="64748B"/>
+          <w:sz w:val="20"/>
+        </w:rPr>
+        <w:t>Last changed: July 23, 2026</w:t>
+      </w:r>
+    </w:p>
     <w:tbl>
       <w:tblPr>
         <w:tblW w:w="0" w:type="auto"/>
@@ -55,7 +66,7 @@
           </w:tcPr>
           <w:p>
             <w:r>
-              <w:t>This guide uses sanitized examples. Replace the sample site names, property IDs, OAuth client ID, and OAuth secret with your own values.</w:t>
+              <w:t>All screenshots in this guide are actual application screenshots that have been cropped and sanitized. Private property names, property IDs, OAuth values, personal paths, and location details are hidden.</w:t>
             </w:r>
           </w:p>
         </w:tc>
@@ -66,7 +77,7 @@
       <w:pPr>
         <w:pStyle w:val="Heading1"/>
       </w:pPr>
-      <w:bookmarkStart w:id="0" w:name="_Toc235732559"/>
+      <w:bookmarkStart w:id="0" w:name="_Toc235734967"/>
       <w:r>
         <w:t>Table of Contents</w:t>
       </w:r>
@@ -91,7 +102,7 @@
       <w:r>
         <w:fldChar w:fldCharType="separate"/>
       </w:r>
-      <w:hyperlink w:anchor="_Toc235732559" w:history="1">
+      <w:hyperlink w:anchor="_Toc235734967" w:history="1">
         <w:r>
           <w:rPr>
             <w:rStyle w:val="Hyperlink"/>
@@ -118,7 +129,7 @@
             <w:noProof/>
             <w:webHidden/>
           </w:rPr>
-          <w:instrText xml:space="preserve"> PAGEREF _Toc235732559 \h </w:instrText>
+          <w:instrText xml:space="preserve"> PAGEREF _Toc235734967 \h </w:instrText>
         </w:r>
         <w:r>
           <w:rPr>
@@ -159,13 +170,13 @@
           <w:noProof/>
         </w:rPr>
       </w:pPr>
-      <w:hyperlink w:anchor="_Toc235732560" w:history="1">
+      <w:hyperlink w:anchor="_Toc235734968" w:history="1">
         <w:r>
           <w:rPr>
             <w:rStyle w:val="Hyperlink"/>
             <w:noProof/>
           </w:rPr>
-          <w:t>Architecture Overview</w:t>
+          <w:t>1. Engineering Purpose</w:t>
         </w:r>
         <w:r>
           <w:rPr>
@@ -186,7 +197,7 @@
             <w:noProof/>
             <w:webHidden/>
           </w:rPr>
-          <w:instrText xml:space="preserve"> PAGEREF _Toc235732560 \h </w:instrText>
+          <w:instrText xml:space="preserve"> PAGEREF _Toc235734968 \h </w:instrText>
         </w:r>
         <w:r>
           <w:rPr>
@@ -227,13 +238,13 @@
           <w:noProof/>
         </w:rPr>
       </w:pPr>
-      <w:hyperlink w:anchor="_Toc235732561" w:history="1">
+      <w:hyperlink w:anchor="_Toc235734969" w:history="1">
         <w:r>
           <w:rPr>
             <w:rStyle w:val="Hyperlink"/>
             <w:noProof/>
           </w:rPr>
-          <w:t>Current Dashboard Surface</w:t>
+          <w:t>2. Project Structure</w:t>
         </w:r>
         <w:r>
           <w:rPr>
@@ -254,7 +265,75 @@
             <w:noProof/>
             <w:webHidden/>
           </w:rPr>
-          <w:instrText xml:space="preserve"> PAGEREF _Toc235732561 \h </w:instrText>
+          <w:instrText xml:space="preserve"> PAGEREF _Toc235734969 \h </w:instrText>
+        </w:r>
+        <w:r>
+          <w:rPr>
+            <w:noProof/>
+            <w:webHidden/>
+          </w:rPr>
+        </w:r>
+        <w:r>
+          <w:rPr>
+            <w:noProof/>
+            <w:webHidden/>
+          </w:rPr>
+          <w:fldChar w:fldCharType="separate"/>
+        </w:r>
+        <w:r>
+          <w:rPr>
+            <w:noProof/>
+            <w:webHidden/>
+          </w:rPr>
+          <w:t>2</w:t>
+        </w:r>
+        <w:r>
+          <w:rPr>
+            <w:noProof/>
+            <w:webHidden/>
+          </w:rPr>
+          <w:fldChar w:fldCharType="end"/>
+        </w:r>
+      </w:hyperlink>
+    </w:p>
+    <w:p>
+      <w:pPr>
+        <w:pStyle w:val="TOC1"/>
+        <w:tabs>
+          <w:tab w:val="right" w:leader="dot" w:pos="10070"/>
+        </w:tabs>
+        <w:rPr>
+          <w:noProof/>
+        </w:rPr>
+      </w:pPr>
+      <w:hyperlink w:anchor="_Toc235734970" w:history="1">
+        <w:r>
+          <w:rPr>
+            <w:rStyle w:val="Hyperlink"/>
+            <w:noProof/>
+          </w:rPr>
+          <w:t>3. Design Directives for Future Work</w:t>
+        </w:r>
+        <w:r>
+          <w:rPr>
+            <w:noProof/>
+            <w:webHidden/>
+          </w:rPr>
+          <w:tab/>
+        </w:r>
+        <w:r>
+          <w:rPr>
+            <w:noProof/>
+            <w:webHidden/>
+          </w:rPr>
+          <w:fldChar w:fldCharType="begin"/>
+        </w:r>
+        <w:r>
+          <w:rPr>
+            <w:noProof/>
+            <w:webHidden/>
+          </w:rPr>
+          <w:instrText xml:space="preserve"> PAGEREF _Toc235734970 \h </w:instrText>
         </w:r>
         <w:r>
           <w:rPr>
@@ -295,13 +374,13 @@
           <w:noProof/>
         </w:rPr>
       </w:pPr>
-      <w:hyperlink w:anchor="_Toc235732562" w:history="1">
+      <w:hyperlink w:anchor="_Toc235734971" w:history="1">
         <w:r>
           <w:rPr>
             <w:rStyle w:val="Hyperlink"/>
             <w:noProof/>
           </w:rPr>
-          <w:t>GA4 Reports Used</w:t>
+          <w:t>4. Data Flow</w:t>
         </w:r>
         <w:r>
           <w:rPr>
@@ -322,7 +401,7 @@
             <w:noProof/>
             <w:webHidden/>
           </w:rPr>
-          <w:instrText xml:space="preserve"> PAGEREF _Toc235732562 \h </w:instrText>
+          <w:instrText xml:space="preserve"> PAGEREF _Toc235734971 \h </w:instrText>
         </w:r>
         <w:r>
           <w:rPr>
@@ -363,13 +442,13 @@
           <w:noProof/>
         </w:rPr>
       </w:pPr>
-      <w:hyperlink w:anchor="_Toc235732563" w:history="1">
+      <w:hyperlink w:anchor="_Toc235734972" w:history="1">
         <w:r>
           <w:rPr>
             <w:rStyle w:val="Hyperlink"/>
             <w:noProof/>
           </w:rPr>
-          <w:t>Authentication and Token Storage</w:t>
+          <w:t>5. GA4 Report Responsibilities</w:t>
         </w:r>
         <w:r>
           <w:rPr>
@@ -390,7 +469,7 @@
             <w:noProof/>
             <w:webHidden/>
           </w:rPr>
-          <w:instrText xml:space="preserve"> PAGEREF _Toc235732563 \h </w:instrText>
+          <w:instrText xml:space="preserve"> PAGEREF _Toc235734972 \h </w:instrText>
         </w:r>
         <w:r>
           <w:rPr>
@@ -431,13 +510,13 @@
           <w:noProof/>
         </w:rPr>
       </w:pPr>
-      <w:hyperlink w:anchor="_Toc235732564" w:history="1">
+      <w:hyperlink w:anchor="_Toc235734973" w:history="1">
         <w:r>
           <w:rPr>
             <w:rStyle w:val="Hyperlink"/>
             <w:noProof/>
           </w:rPr>
-          <w:t>Portable SQLite Settings</w:t>
+          <w:t>6. Authentication and Refresh Tokens</w:t>
         </w:r>
         <w:r>
           <w:rPr>
@@ -458,7 +537,7 @@
             <w:noProof/>
             <w:webHidden/>
           </w:rPr>
-          <w:instrText xml:space="preserve"> PAGEREF _Toc235732564 \h </w:instrText>
+          <w:instrText xml:space="preserve"> PAGEREF _Toc235734973 \h </w:instrText>
         </w:r>
         <w:r>
           <w:rPr>
@@ -499,13 +578,13 @@
           <w:noProof/>
         </w:rPr>
       </w:pPr>
-      <w:hyperlink w:anchor="_Toc235732565" w:history="1">
+      <w:hyperlink w:anchor="_Toc235734974" w:history="1">
         <w:r>
           <w:rPr>
             <w:rStyle w:val="Hyperlink"/>
             <w:noProof/>
           </w:rPr>
-          <w:t>Designer/Editability Rules</w:t>
+          <w:t>7. All-Websites Merge Behavior</w:t>
         </w:r>
         <w:r>
           <w:rPr>
@@ -526,7 +605,7 @@
             <w:noProof/>
             <w:webHidden/>
           </w:rPr>
-          <w:instrText xml:space="preserve"> PAGEREF _Toc235732565 \h </w:instrText>
+          <w:instrText xml:space="preserve"> PAGEREF _Toc235734974 \h </w:instrText>
         </w:r>
         <w:r>
           <w:rPr>
@@ -567,13 +646,13 @@
           <w:noProof/>
         </w:rPr>
       </w:pPr>
-      <w:hyperlink w:anchor="_Toc235732566" w:history="1">
+      <w:hyperlink w:anchor="_Toc235734975" w:history="1">
         <w:r>
           <w:rPr>
             <w:rStyle w:val="Hyperlink"/>
             <w:noProof/>
           </w:rPr>
-          <w:t>Build and Validation</w:t>
+          <w:t>8. SQLite Storage Model</w:t>
         </w:r>
         <w:r>
           <w:rPr>
@@ -594,7 +673,7 @@
             <w:noProof/>
             <w:webHidden/>
           </w:rPr>
-          <w:instrText xml:space="preserve"> PAGEREF _Toc235732566 \h </w:instrText>
+          <w:instrText xml:space="preserve"> PAGEREF _Toc235734975 \h </w:instrText>
         </w:r>
         <w:r>
           <w:rPr>
@@ -635,13 +714,13 @@
           <w:noProof/>
         </w:rPr>
       </w:pPr>
-      <w:hyperlink w:anchor="_Toc235732567" w:history="1">
+      <w:hyperlink w:anchor="_Toc235734976" w:history="1">
         <w:r>
           <w:rPr>
             <w:rStyle w:val="Hyperlink"/>
             <w:noProof/>
           </w:rPr>
-          <w:t>Public Repository Hygiene</w:t>
+          <w:t>9. UI Implementation Notes</w:t>
         </w:r>
         <w:r>
           <w:rPr>
@@ -662,7 +741,7 @@
             <w:noProof/>
             <w:webHidden/>
           </w:rPr>
-          <w:instrText xml:space="preserve"> PAGEREF _Toc235732567 \h </w:instrText>
+          <w:instrText xml:space="preserve"> PAGEREF _Toc235734976 \h </w:instrText>
         </w:r>
         <w:r>
           <w:rPr>
@@ -694,6 +773,482 @@
       </w:hyperlink>
     </w:p>
     <w:p>
+      <w:pPr>
+        <w:pStyle w:val="TOC1"/>
+        <w:tabs>
+          <w:tab w:val="right" w:leader="dot" w:pos="10070"/>
+        </w:tabs>
+        <w:rPr>
+          <w:noProof/>
+        </w:rPr>
+      </w:pPr>
+      <w:hyperlink w:anchor="_Toc235734977" w:history="1">
+        <w:r>
+          <w:rPr>
+            <w:rStyle w:val="Hyperlink"/>
+            <w:noProof/>
+          </w:rPr>
+          <w:t>10. GA4 Request and Parser Notes</w:t>
+        </w:r>
+        <w:r>
+          <w:rPr>
+            <w:noProof/>
+            <w:webHidden/>
+          </w:rPr>
+          <w:tab/>
+        </w:r>
+        <w:r>
+          <w:rPr>
+            <w:noProof/>
+            <w:webHidden/>
+          </w:rPr>
+          <w:fldChar w:fldCharType="begin"/>
+        </w:r>
+        <w:r>
+          <w:rPr>
+            <w:noProof/>
+            <w:webHidden/>
+          </w:rPr>
+          <w:instrText xml:space="preserve"> PAGEREF _Toc235734977 \h </w:instrText>
+        </w:r>
+        <w:r>
+          <w:rPr>
+            <w:noProof/>
+            <w:webHidden/>
+          </w:rPr>
+        </w:r>
+        <w:r>
+          <w:rPr>
+            <w:noProof/>
+            <w:webHidden/>
+          </w:rPr>
+          <w:fldChar w:fldCharType="separate"/>
+        </w:r>
+        <w:r>
+          <w:rPr>
+            <w:noProof/>
+            <w:webHidden/>
+          </w:rPr>
+          <w:t>6</w:t>
+        </w:r>
+        <w:r>
+          <w:rPr>
+            <w:noProof/>
+            <w:webHidden/>
+          </w:rPr>
+          <w:fldChar w:fldCharType="end"/>
+        </w:r>
+      </w:hyperlink>
+    </w:p>
+    <w:p>
+      <w:pPr>
+        <w:pStyle w:val="TOC1"/>
+        <w:tabs>
+          <w:tab w:val="right" w:leader="dot" w:pos="10070"/>
+        </w:tabs>
+        <w:rPr>
+          <w:noProof/>
+        </w:rPr>
+      </w:pPr>
+      <w:hyperlink w:anchor="_Toc235734978" w:history="1">
+        <w:r>
+          <w:rPr>
+            <w:rStyle w:val="Hyperlink"/>
+            <w:noProof/>
+          </w:rPr>
+          <w:t>11. Build and Smoke Test</w:t>
+        </w:r>
+        <w:r>
+          <w:rPr>
+            <w:noProof/>
+            <w:webHidden/>
+          </w:rPr>
+          <w:tab/>
+        </w:r>
+        <w:r>
+          <w:rPr>
+            <w:noProof/>
+            <w:webHidden/>
+          </w:rPr>
+          <w:fldChar w:fldCharType="begin"/>
+        </w:r>
+        <w:r>
+          <w:rPr>
+            <w:noProof/>
+            <w:webHidden/>
+          </w:rPr>
+          <w:instrText xml:space="preserve"> PAGEREF _Toc235734978 \h </w:instrText>
+        </w:r>
+        <w:r>
+          <w:rPr>
+            <w:noProof/>
+            <w:webHidden/>
+          </w:rPr>
+        </w:r>
+        <w:r>
+          <w:rPr>
+            <w:noProof/>
+            <w:webHidden/>
+          </w:rPr>
+          <w:fldChar w:fldCharType="separate"/>
+        </w:r>
+        <w:r>
+          <w:rPr>
+            <w:noProof/>
+            <w:webHidden/>
+          </w:rPr>
+          <w:t>7</w:t>
+        </w:r>
+        <w:r>
+          <w:rPr>
+            <w:noProof/>
+            <w:webHidden/>
+          </w:rPr>
+          <w:fldChar w:fldCharType="end"/>
+        </w:r>
+      </w:hyperlink>
+    </w:p>
+    <w:p>
+      <w:pPr>
+        <w:pStyle w:val="TOC1"/>
+        <w:tabs>
+          <w:tab w:val="right" w:leader="dot" w:pos="10070"/>
+        </w:tabs>
+        <w:rPr>
+          <w:noProof/>
+        </w:rPr>
+      </w:pPr>
+      <w:hyperlink w:anchor="_Toc235734979" w:history="1">
+        <w:r>
+          <w:rPr>
+            <w:rStyle w:val="Hyperlink"/>
+            <w:noProof/>
+          </w:rPr>
+          <w:t>12. Release and Repository Checklist</w:t>
+        </w:r>
+        <w:r>
+          <w:rPr>
+            <w:noProof/>
+            <w:webHidden/>
+          </w:rPr>
+          <w:tab/>
+        </w:r>
+        <w:r>
+          <w:rPr>
+            <w:noProof/>
+            <w:webHidden/>
+          </w:rPr>
+          <w:fldChar w:fldCharType="begin"/>
+        </w:r>
+        <w:r>
+          <w:rPr>
+            <w:noProof/>
+            <w:webHidden/>
+          </w:rPr>
+          <w:instrText xml:space="preserve"> PAGEREF _Toc235734979 \h </w:instrText>
+        </w:r>
+        <w:r>
+          <w:rPr>
+            <w:noProof/>
+            <w:webHidden/>
+          </w:rPr>
+        </w:r>
+        <w:r>
+          <w:rPr>
+            <w:noProof/>
+            <w:webHidden/>
+          </w:rPr>
+          <w:fldChar w:fldCharType="separate"/>
+        </w:r>
+        <w:r>
+          <w:rPr>
+            <w:noProof/>
+            <w:webHidden/>
+          </w:rPr>
+          <w:t>7</w:t>
+        </w:r>
+        <w:r>
+          <w:rPr>
+            <w:noProof/>
+            <w:webHidden/>
+          </w:rPr>
+          <w:fldChar w:fldCharType="end"/>
+        </w:r>
+      </w:hyperlink>
+    </w:p>
+    <w:p>
+      <w:pPr>
+        <w:pStyle w:val="TOC1"/>
+        <w:tabs>
+          <w:tab w:val="right" w:leader="dot" w:pos="10070"/>
+        </w:tabs>
+        <w:rPr>
+          <w:noProof/>
+        </w:rPr>
+      </w:pPr>
+      <w:hyperlink w:anchor="_Toc235734980" w:history="1">
+        <w:r>
+          <w:rPr>
+            <w:rStyle w:val="Hyperlink"/>
+            <w:noProof/>
+          </w:rPr>
+          <w:t>13. Public Repository Hygiene</w:t>
+        </w:r>
+        <w:r>
+          <w:rPr>
+            <w:noProof/>
+            <w:webHidden/>
+          </w:rPr>
+          <w:tab/>
+        </w:r>
+        <w:r>
+          <w:rPr>
+            <w:noProof/>
+            <w:webHidden/>
+          </w:rPr>
+          <w:fldChar w:fldCharType="begin"/>
+        </w:r>
+        <w:r>
+          <w:rPr>
+            <w:noProof/>
+            <w:webHidden/>
+          </w:rPr>
+          <w:instrText xml:space="preserve"> PAGEREF _Toc235734980 \h </w:instrText>
+        </w:r>
+        <w:r>
+          <w:rPr>
+            <w:noProof/>
+            <w:webHidden/>
+          </w:rPr>
+        </w:r>
+        <w:r>
+          <w:rPr>
+            <w:noProof/>
+            <w:webHidden/>
+          </w:rPr>
+          <w:fldChar w:fldCharType="separate"/>
+        </w:r>
+        <w:r>
+          <w:rPr>
+            <w:noProof/>
+            <w:webHidden/>
+          </w:rPr>
+          <w:t>7</w:t>
+        </w:r>
+        <w:r>
+          <w:rPr>
+            <w:noProof/>
+            <w:webHidden/>
+          </w:rPr>
+          <w:fldChar w:fldCharType="end"/>
+        </w:r>
+      </w:hyperlink>
+    </w:p>
+    <w:p>
+      <w:pPr>
+        <w:pStyle w:val="TOC1"/>
+        <w:tabs>
+          <w:tab w:val="right" w:leader="dot" w:pos="10070"/>
+        </w:tabs>
+        <w:rPr>
+          <w:noProof/>
+        </w:rPr>
+      </w:pPr>
+      <w:hyperlink w:anchor="_Toc235734981" w:history="1">
+        <w:r>
+          <w:rPr>
+            <w:rStyle w:val="Hyperlink"/>
+            <w:noProof/>
+          </w:rPr>
+          <w:t>14. Documentation Maintenance</w:t>
+        </w:r>
+        <w:r>
+          <w:rPr>
+            <w:noProof/>
+            <w:webHidden/>
+          </w:rPr>
+          <w:tab/>
+        </w:r>
+        <w:r>
+          <w:rPr>
+            <w:noProof/>
+            <w:webHidden/>
+          </w:rPr>
+          <w:fldChar w:fldCharType="begin"/>
+        </w:r>
+        <w:r>
+          <w:rPr>
+            <w:noProof/>
+            <w:webHidden/>
+          </w:rPr>
+          <w:instrText xml:space="preserve"> PAGEREF _Toc235734981 \h </w:instrText>
+        </w:r>
+        <w:r>
+          <w:rPr>
+            <w:noProof/>
+            <w:webHidden/>
+          </w:rPr>
+        </w:r>
+        <w:r>
+          <w:rPr>
+            <w:noProof/>
+            <w:webHidden/>
+          </w:rPr>
+          <w:fldChar w:fldCharType="separate"/>
+        </w:r>
+        <w:r>
+          <w:rPr>
+            <w:noProof/>
+            <w:webHidden/>
+          </w:rPr>
+          <w:t>8</w:t>
+        </w:r>
+        <w:r>
+          <w:rPr>
+            <w:noProof/>
+            <w:webHidden/>
+          </w:rPr>
+          <w:fldChar w:fldCharType="end"/>
+        </w:r>
+      </w:hyperlink>
+    </w:p>
+    <w:p>
+      <w:pPr>
+        <w:pStyle w:val="TOC1"/>
+        <w:tabs>
+          <w:tab w:val="right" w:leader="dot" w:pos="10070"/>
+        </w:tabs>
+        <w:rPr>
+          <w:noProof/>
+        </w:rPr>
+      </w:pPr>
+      <w:hyperlink w:anchor="_Toc235734982" w:history="1">
+        <w:r>
+          <w:rPr>
+            <w:rStyle w:val="Hyperlink"/>
+            <w:noProof/>
+          </w:rPr>
+          <w:t>15. Maintenance Risk Areas</w:t>
+        </w:r>
+        <w:r>
+          <w:rPr>
+            <w:noProof/>
+            <w:webHidden/>
+          </w:rPr>
+          <w:tab/>
+        </w:r>
+        <w:r>
+          <w:rPr>
+            <w:noProof/>
+            <w:webHidden/>
+          </w:rPr>
+          <w:fldChar w:fldCharType="begin"/>
+        </w:r>
+        <w:r>
+          <w:rPr>
+            <w:noProof/>
+            <w:webHidden/>
+          </w:rPr>
+          <w:instrText xml:space="preserve"> PAGEREF _Toc235734982 \h </w:instrText>
+        </w:r>
+        <w:r>
+          <w:rPr>
+            <w:noProof/>
+            <w:webHidden/>
+          </w:rPr>
+        </w:r>
+        <w:r>
+          <w:rPr>
+            <w:noProof/>
+            <w:webHidden/>
+          </w:rPr>
+          <w:fldChar w:fldCharType="separate"/>
+        </w:r>
+        <w:r>
+          <w:rPr>
+            <w:noProof/>
+            <w:webHidden/>
+          </w:rPr>
+          <w:t>8</w:t>
+        </w:r>
+        <w:r>
+          <w:rPr>
+            <w:noProof/>
+            <w:webHidden/>
+          </w:rPr>
+          <w:fldChar w:fldCharType="end"/>
+        </w:r>
+      </w:hyperlink>
+    </w:p>
+    <w:p>
+      <w:pPr>
+        <w:pStyle w:val="TOC1"/>
+        <w:tabs>
+          <w:tab w:val="right" w:leader="dot" w:pos="10070"/>
+        </w:tabs>
+        <w:rPr>
+          <w:noProof/>
+        </w:rPr>
+      </w:pPr>
+      <w:hyperlink w:anchor="_Toc235734983" w:history="1">
+        <w:r>
+          <w:rPr>
+            <w:rStyle w:val="Hyperlink"/>
+            <w:noProof/>
+          </w:rPr>
+          <w:t>16. Known Limitations and Future Work</w:t>
+        </w:r>
+        <w:r>
+          <w:rPr>
+            <w:noProof/>
+            <w:webHidden/>
+          </w:rPr>
+          <w:tab/>
+        </w:r>
+        <w:r>
+          <w:rPr>
+            <w:noProof/>
+            <w:webHidden/>
+          </w:rPr>
+          <w:fldChar w:fldCharType="begin"/>
+        </w:r>
+        <w:r>
+          <w:rPr>
+            <w:noProof/>
+            <w:webHidden/>
+          </w:rPr>
+          <w:instrText xml:space="preserve"> PAGEREF _Toc235734983 \h </w:instrText>
+        </w:r>
+        <w:r>
+          <w:rPr>
+            <w:noProof/>
+            <w:webHidden/>
+          </w:rPr>
+        </w:r>
+        <w:r>
+          <w:rPr>
+            <w:noProof/>
+            <w:webHidden/>
+          </w:rPr>
+          <w:fldChar w:fldCharType="separate"/>
+        </w:r>
+        <w:r>
+          <w:rPr>
+            <w:noProof/>
+            <w:webHidden/>
+          </w:rPr>
+          <w:t>9</w:t>
+        </w:r>
+        <w:r>
+          <w:rPr>
+            <w:noProof/>
+            <w:webHidden/>
+          </w:rPr>
+          <w:fldChar w:fldCharType="end"/>
+        </w:r>
+      </w:hyperlink>
+    </w:p>
+    <w:p>
       <w:r>
         <w:fldChar w:fldCharType="end"/>
       </w:r>
@@ -707,16 +1262,977 @@
       <w:pPr>
         <w:pStyle w:val="Heading1"/>
       </w:pPr>
-      <w:bookmarkStart w:id="1" w:name="_Toc235732560"/>
+      <w:bookmarkStart w:id="1" w:name="_Toc235734968"/>
       <w:r>
         <w:lastRenderedPageBreak/>
-        <w:t>Architecture Overview</w:t>
+        <w:t>1. Engineering Purpose</w:t>
       </w:r>
       <w:bookmarkEnd w:id="1"/>
     </w:p>
     <w:p>
       <w:r>
-        <w:t>The application is a Delphi FMX desktop dashboard. Forms remain editable in the IDE. Runtime code retrieves GA4 data, maps responses into memory models, and updates existing designer controls.</w:t>
+        <w:t>This project is a Delphi FMX desktop application that retrieves selected GA4 data, formats it into in-memory models, and displays it in a clean dashboard. The engineering goal is not to clone GA4. The goal is to make the highest-value website analytics easier to read, while keeping forms editable in RAD Studio and keeping local storage minimal.</w:t>
+      </w:r>
+    </w:p>
+    <w:p>
+      <w:pPr>
+        <w:jc w:val="center"/>
+      </w:pPr>
+      <w:r>
+        <w:rPr>
+          <w:noProof/>
+        </w:rPr>
+        <w:drawing>
+          <wp:inline distT="0" distB="0" distL="0" distR="0" wp14:anchorId="673F06FD" wp14:editId="77FBFBC9">
+            <wp:extent cx="6035040" cy="2384750"/>
+            <wp:effectExtent l="0" t="0" r="0" b="0"/>
+            <wp:docPr id="1" name="Picture 1"/>
+            <wp:cNvGraphicFramePr>
+              <a:graphicFrameLocks xmlns:a="http://schemas.openxmlformats.org/drawingml/2006/main" noChangeAspect="1"/>
+            </wp:cNvGraphicFramePr>
+            <a:graphic xmlns:a="http://schemas.openxmlformats.org/drawingml/2006/main">
+              <a:graphicData uri="http://schemas.openxmlformats.org/drawingml/2006/picture">
+                <pic:pic xmlns:pic="http://schemas.openxmlformats.org/drawingml/2006/picture">
+                  <pic:nvPicPr>
+                    <pic:cNvPr id="0" name="real-dashboard-current-redacted.png"/>
+                    <pic:cNvPicPr/>
+                  </pic:nvPicPr>
+                  <pic:blipFill>
+                    <a:blip r:embed="rId6"/>
+                    <a:stretch>
+                      <a:fillRect/>
+                    </a:stretch>
+                  </pic:blipFill>
+                  <pic:spPr>
+                    <a:xfrm>
+                      <a:off x="0" y="0"/>
+                      <a:ext cx="6035040" cy="2384750"/>
+                    </a:xfrm>
+                    <a:prstGeom prst="rect">
+                      <a:avLst/>
+                    </a:prstGeom>
+                  </pic:spPr>
+                </pic:pic>
+              </a:graphicData>
+            </a:graphic>
+          </wp:inline>
+        </w:drawing>
+      </w:r>
+    </w:p>
+    <w:p>
+      <w:pPr>
+        <w:jc w:val="center"/>
+      </w:pPr>
+      <w:r>
+        <w:rPr>
+          <w:i/>
+          <w:color w:val="64748B"/>
+          <w:sz w:val="18"/>
+        </w:rPr>
+        <w:t>Actual dashboard screenshot with private report rows redacted.</w:t>
+      </w:r>
+    </w:p>
+    <w:p>
+      <w:pPr>
+        <w:pStyle w:val="Heading1"/>
+      </w:pPr>
+      <w:bookmarkStart w:id="2" w:name="_Toc235734969"/>
+      <w:r>
+        <w:t>2. Project Structure</w:t>
+      </w:r>
+      <w:bookmarkEnd w:id="2"/>
+    </w:p>
+    <w:tbl>
+      <w:tblPr>
+        <w:tblStyle w:val="TableGrid"/>
+        <w:tblW w:w="0" w:type="auto"/>
+        <w:jc w:val="center"/>
+        <w:tblCellMar>
+          <w:top w:w="120" w:type="dxa"/>
+          <w:left w:w="120" w:type="dxa"/>
+          <w:bottom w:w="120" w:type="dxa"/>
+          <w:right w:w="120" w:type="dxa"/>
+        </w:tblCellMar>
+        <w:tblLook w:val="04A0" w:firstRow="1" w:lastRow="0" w:firstColumn="1" w:lastColumn="0" w:noHBand="0" w:noVBand="1"/>
+      </w:tblPr>
+      <w:tblGrid>
+        <w:gridCol w:w="5040"/>
+        <w:gridCol w:w="5040"/>
+      </w:tblGrid>
+      <w:tr>
+        <w:trPr>
+          <w:jc w:val="center"/>
+        </w:trPr>
+        <w:tc>
+          <w:tcPr>
+            <w:tcW w:w="5040" w:type="dxa"/>
+            <w:shd w:val="clear" w:color="auto" w:fill="F2F7FC"/>
+          </w:tcPr>
+          <w:p>
+            <w:r>
+              <w:t>Folder/file</w:t>
+            </w:r>
+          </w:p>
+        </w:tc>
+        <w:tc>
+          <w:tcPr>
+            <w:tcW w:w="5040" w:type="dxa"/>
+            <w:shd w:val="clear" w:color="auto" w:fill="F2F7FC"/>
+          </w:tcPr>
+          <w:p>
+            <w:r>
+              <w:t>Role</w:t>
+            </w:r>
+          </w:p>
+        </w:tc>
+      </w:tr>
+      <w:tr>
+        <w:trPr>
+          <w:jc w:val="center"/>
+        </w:trPr>
+        <w:tc>
+          <w:tcPr>
+            <w:tcW w:w="5040" w:type="dxa"/>
+          </w:tcPr>
+          <w:p>
+            <w:r>
+              <w:t>WebsiteAnalytics.dpr / .dproj</w:t>
+            </w:r>
+          </w:p>
+        </w:tc>
+        <w:tc>
+          <w:tcPr>
+            <w:tcW w:w="5040" w:type="dxa"/>
+          </w:tcPr>
+          <w:p>
+            <w:r>
+              <w:t>Application entry point and RAD Studio project file.</w:t>
+            </w:r>
+          </w:p>
+        </w:tc>
+      </w:tr>
+      <w:tr>
+        <w:trPr>
+          <w:jc w:val="center"/>
+        </w:trPr>
+        <w:tc>
+          <w:tcPr>
+            <w:tcW w:w="5040" w:type="dxa"/>
+          </w:tcPr>
+          <w:p>
+            <w:r>
+              <w:t>WebsiteAnalytics.MainForm.pas/.fmx</w:t>
+            </w:r>
+          </w:p>
+        </w:tc>
+        <w:tc>
+          <w:tcPr>
+            <w:tcW w:w="5040" w:type="dxa"/>
+          </w:tcPr>
+          <w:p>
+            <w:r>
+              <w:t>Main dashboard form, hero controls, charts, grids, and realtime display.</w:t>
+            </w:r>
+          </w:p>
+        </w:tc>
+      </w:tr>
+      <w:tr>
+        <w:trPr>
+          <w:jc w:val="center"/>
+        </w:trPr>
+        <w:tc>
+          <w:tcPr>
+            <w:tcW w:w="5040" w:type="dxa"/>
+          </w:tcPr>
+          <w:p>
+            <w:r>
+              <w:t>WebsiteAnalytics.SettingsForm.pas/.fmx</w:t>
+            </w:r>
+          </w:p>
+        </w:tc>
+        <w:tc>
+          <w:tcPr>
+            <w:tcW w:w="5040" w:type="dxa"/>
+          </w:tcPr>
+          <w:p>
+            <w:r>
+              <w:t>Settings and Google sign-in UI.</w:t>
+            </w:r>
+          </w:p>
+        </w:tc>
+      </w:tr>
+      <w:tr>
+        <w:trPr>
+          <w:jc w:val="center"/>
+        </w:trPr>
+        <w:tc>
+          <w:tcPr>
+            <w:tcW w:w="5040" w:type="dxa"/>
+          </w:tcPr>
+          <w:p>
+            <w:r>
+              <w:t>WebsiteAnalytics.PropertyManagerForm.pas/.fmx</w:t>
+            </w:r>
+          </w:p>
+        </w:tc>
+        <w:tc>
+          <w:tcPr>
+            <w:tcW w:w="5040" w:type="dxa"/>
+          </w:tcPr>
+          <w:p>
+            <w:r>
+              <w:t>Manage website/GA4 property definitions.</w:t>
+            </w:r>
+          </w:p>
+        </w:tc>
+      </w:tr>
+      <w:tr>
+        <w:trPr>
+          <w:jc w:val="center"/>
+        </w:trPr>
+        <w:tc>
+          <w:tcPr>
+            <w:tcW w:w="5040" w:type="dxa"/>
+          </w:tcPr>
+          <w:p>
+            <w:r>
+              <w:t>WebsiteAnalytics.GA4DataModule.pas</w:t>
+            </w:r>
+          </w:p>
+        </w:tc>
+        <w:tc>
+          <w:tcPr>
+            <w:tcW w:w="5040" w:type="dxa"/>
+          </w:tcPr>
+          <w:p>
+            <w:r>
+              <w:t>Builds GA4 API requests, executes HTTP calls, parses report responses.</w:t>
+            </w:r>
+          </w:p>
+        </w:tc>
+      </w:tr>
+      <w:tr>
+        <w:trPr>
+          <w:jc w:val="center"/>
+        </w:trPr>
+        <w:tc>
+          <w:tcPr>
+            <w:tcW w:w="5040" w:type="dxa"/>
+          </w:tcPr>
+          <w:p>
+            <w:r>
+              <w:t>WebsiteAnalytics.AuthenticationDataModule.pas</w:t>
+            </w:r>
+          </w:p>
+        </w:tc>
+        <w:tc>
+          <w:tcPr>
+            <w:tcW w:w="5040" w:type="dxa"/>
+          </w:tcPr>
+          <w:p>
+            <w:r>
+              <w:t>Handles desktop OAuth, loopback redirect, access token, and refresh token logic.</w:t>
+            </w:r>
+          </w:p>
+        </w:tc>
+      </w:tr>
+      <w:tr>
+        <w:trPr>
+          <w:jc w:val="center"/>
+        </w:trPr>
+        <w:tc>
+          <w:tcPr>
+            <w:tcW w:w="5040" w:type="dxa"/>
+          </w:tcPr>
+          <w:p>
+            <w:r>
+              <w:t>WebsiteAnalytics.SettingsDataModule.pas</w:t>
+            </w:r>
+          </w:p>
+        </w:tc>
+        <w:tc>
+          <w:tcPr>
+            <w:tcW w:w="5040" w:type="dxa"/>
+          </w:tcPr>
+          <w:p>
+            <w:r>
+              <w:t>SQLite-backed settings and schema management.</w:t>
+            </w:r>
+          </w:p>
+        </w:tc>
+      </w:tr>
+      <w:tr>
+        <w:trPr>
+          <w:jc w:val="center"/>
+        </w:trPr>
+        <w:tc>
+          <w:tcPr>
+            <w:tcW w:w="5040" w:type="dxa"/>
+          </w:tcPr>
+          <w:p>
+            <w:r>
+              <w:t>WebsiteAnalytics.Models.pas</w:t>
+            </w:r>
+          </w:p>
+        </w:tc>
+        <w:tc>
+          <w:tcPr>
+            <w:tcW w:w="5040" w:type="dxa"/>
+          </w:tcPr>
+          <w:p>
+            <w:r>
+              <w:t xml:space="preserve">Memory model types for snapshots, KPI summaries, </w:t>
+            </w:r>
+            <w:r>
+              <w:lastRenderedPageBreak/>
+              <w:t>trend points, content rows, and location rows.</w:t>
+            </w:r>
+          </w:p>
+        </w:tc>
+      </w:tr>
+      <w:tr>
+        <w:trPr>
+          <w:jc w:val="center"/>
+        </w:trPr>
+        <w:tc>
+          <w:tcPr>
+            <w:tcW w:w="5040" w:type="dxa"/>
+          </w:tcPr>
+          <w:p>
+            <w:r>
+              <w:lastRenderedPageBreak/>
+              <w:t>help</w:t>
+            </w:r>
+          </w:p>
+        </w:tc>
+        <w:tc>
+          <w:tcPr>
+            <w:tcW w:w="5040" w:type="dxa"/>
+          </w:tcPr>
+          <w:p>
+            <w:r>
+              <w:t>Local HTML help used by the Help button.</w:t>
+            </w:r>
+          </w:p>
+        </w:tc>
+      </w:tr>
+      <w:tr>
+        <w:trPr>
+          <w:jc w:val="center"/>
+        </w:trPr>
+        <w:tc>
+          <w:tcPr>
+            <w:tcW w:w="5040" w:type="dxa"/>
+          </w:tcPr>
+          <w:p>
+            <w:r>
+              <w:t>docs/guides and docs/pdf</w:t>
+            </w:r>
+          </w:p>
+        </w:tc>
+        <w:tc>
+          <w:tcPr>
+            <w:tcW w:w="5040" w:type="dxa"/>
+          </w:tcPr>
+          <w:p>
+            <w:r>
+              <w:t>Editable guides and companion PDF output.</w:t>
+            </w:r>
+          </w:p>
+        </w:tc>
+      </w:tr>
+    </w:tbl>
+    <w:p>
+      <w:pPr>
+        <w:pStyle w:val="Heading1"/>
+      </w:pPr>
+      <w:bookmarkStart w:id="3" w:name="_Toc235734970"/>
+      <w:r>
+        <w:t>3. Design Directives for Future Work</w:t>
+      </w:r>
+      <w:bookmarkEnd w:id="3"/>
+    </w:p>
+    <w:p>
+      <w:pPr>
+        <w:pStyle w:val="ListBullet"/>
+      </w:pPr>
+      <w:r>
+        <w:t>Forms should remain editable in the RAD Studio IDE.</w:t>
+      </w:r>
+    </w:p>
+    <w:p>
+      <w:pPr>
+        <w:pStyle w:val="ListBullet"/>
+      </w:pPr>
+      <w:r>
+        <w:t>Avoid runtime-only UI construction unless it is unavoidable and approved.</w:t>
+      </w:r>
+    </w:p>
+    <w:p>
+      <w:pPr>
+        <w:pStyle w:val="ListBullet"/>
+      </w:pPr>
+      <w:r>
+        <w:t>Do not add helper code unless the developer approves it.</w:t>
+      </w:r>
+    </w:p>
+    <w:p>
+      <w:pPr>
+        <w:pStyle w:val="ListBullet"/>
+      </w:pPr>
+      <w:r>
+        <w:t>Prefer Object Inspector settings for layout where practical.</w:t>
+      </w:r>
+    </w:p>
+    <w:p>
+      <w:pPr>
+        <w:pStyle w:val="ListBullet"/>
+      </w:pPr>
+      <w:r>
+        <w:t>Make a pre-change backup on D: before modifying project files.</w:t>
+      </w:r>
+    </w:p>
+    <w:p>
+      <w:pPr>
+        <w:pStyle w:val="ListBullet"/>
+      </w:pPr>
+      <w:r>
+        <w:t>After approved changes are validated, commit and push both the private and public repositories.</w:t>
+      </w:r>
+    </w:p>
+    <w:p>
+      <w:pPr>
+        <w:pStyle w:val="Heading1"/>
+      </w:pPr>
+      <w:bookmarkStart w:id="4" w:name="_Toc235734971"/>
+      <w:r>
+        <w:t>4. Data Flow</w:t>
+      </w:r>
+      <w:bookmarkEnd w:id="4"/>
+    </w:p>
+    <w:p>
+      <w:pPr>
+        <w:pStyle w:val="ListNumber"/>
+      </w:pPr>
+      <w:r>
+        <w:t>The user selects a property and date range in the main form.</w:t>
+      </w:r>
+    </w:p>
+    <w:p>
+      <w:pPr>
+        <w:pStyle w:val="ListNumber"/>
+      </w:pPr>
+      <w:r>
+        <w:t>The main form requests an access token from the authentication data module.</w:t>
+      </w:r>
+    </w:p>
+    <w:p>
+      <w:pPr>
+        <w:pStyle w:val="ListNumber"/>
+      </w:pPr>
+      <w:r>
+        <w:t>The GA4 data module builds runReport or realtime report JSON requests.</w:t>
+      </w:r>
+    </w:p>
+    <w:p>
+      <w:pPr>
+        <w:pStyle w:val="ListNumber"/>
+      </w:pPr>
+      <w:r>
+        <w:t>HTTP responses are parsed into in-memory model objects.</w:t>
+      </w:r>
+    </w:p>
+    <w:p>
+      <w:pPr>
+        <w:pStyle w:val="ListNumber"/>
+      </w:pPr>
+      <w:r>
+        <w:t>The main form updates existing FMX controls: cards, grids, chart paint boxes, and realtime labels.</w:t>
+      </w:r>
+    </w:p>
+    <w:p>
+      <w:pPr>
+        <w:pStyle w:val="ListNumber"/>
+      </w:pPr>
+      <w:r>
+        <w:t>The report snapshot remains in memory and is discarded when the app closes.</w:t>
+      </w:r>
+    </w:p>
+    <w:p>
+      <w:pPr>
+        <w:pStyle w:val="Heading1"/>
+      </w:pPr>
+      <w:bookmarkStart w:id="5" w:name="_Toc235734972"/>
+      <w:r>
+        <w:t>5. GA4 Report Responsibilities</w:t>
+      </w:r>
+      <w:bookmarkEnd w:id="5"/>
+    </w:p>
+    <w:tbl>
+      <w:tblPr>
+        <w:tblStyle w:val="TableGrid"/>
+        <w:tblW w:w="0" w:type="auto"/>
+        <w:jc w:val="center"/>
+        <w:tblCellMar>
+          <w:top w:w="120" w:type="dxa"/>
+          <w:left w:w="120" w:type="dxa"/>
+          <w:bottom w:w="120" w:type="dxa"/>
+          <w:right w:w="120" w:type="dxa"/>
+        </w:tblCellMar>
+        <w:tblLook w:val="04A0" w:firstRow="1" w:lastRow="0" w:firstColumn="1" w:lastColumn="0" w:noHBand="0" w:noVBand="1"/>
+      </w:tblPr>
+      <w:tblGrid>
+        <w:gridCol w:w="3360"/>
+        <w:gridCol w:w="3360"/>
+        <w:gridCol w:w="3360"/>
+      </w:tblGrid>
+      <w:tr>
+        <w:trPr>
+          <w:jc w:val="center"/>
+        </w:trPr>
+        <w:tc>
+          <w:tcPr>
+            <w:tcW w:w="3360" w:type="dxa"/>
+            <w:shd w:val="clear" w:color="auto" w:fill="F2F7FC"/>
+          </w:tcPr>
+          <w:p>
+            <w:r>
+              <w:t>Report area</w:t>
+            </w:r>
+          </w:p>
+        </w:tc>
+        <w:tc>
+          <w:tcPr>
+            <w:tcW w:w="3360" w:type="dxa"/>
+            <w:shd w:val="clear" w:color="auto" w:fill="F2F7FC"/>
+          </w:tcPr>
+          <w:p>
+            <w:r>
+              <w:t>GA4 data used</w:t>
+            </w:r>
+          </w:p>
+        </w:tc>
+        <w:tc>
+          <w:tcPr>
+            <w:tcW w:w="3360" w:type="dxa"/>
+            <w:shd w:val="clear" w:color="auto" w:fill="F2F7FC"/>
+          </w:tcPr>
+          <w:p>
+            <w:r>
+              <w:t>Displayed as</w:t>
+            </w:r>
+          </w:p>
+        </w:tc>
+      </w:tr>
+      <w:tr>
+        <w:trPr>
+          <w:jc w:val="center"/>
+        </w:trPr>
+        <w:tc>
+          <w:tcPr>
+            <w:tcW w:w="3360" w:type="dxa"/>
+          </w:tcPr>
+          <w:p>
+            <w:r>
+              <w:t>Summary cards</w:t>
+            </w:r>
+          </w:p>
+        </w:tc>
+        <w:tc>
+          <w:tcPr>
+            <w:tcW w:w="3360" w:type="dxa"/>
+          </w:tcPr>
+          <w:p>
+            <w:r>
+              <w:t>Users, views, downloads/events, active users, realtime views, events/session, scrolled users</w:t>
+            </w:r>
+          </w:p>
+        </w:tc>
+        <w:tc>
+          <w:tcPr>
+            <w:tcW w:w="3360" w:type="dxa"/>
+          </w:tcPr>
+          <w:p>
+            <w:r>
+              <w:t>Ten compact cards.</w:t>
+            </w:r>
+          </w:p>
+        </w:tc>
+      </w:tr>
+      <w:tr>
+        <w:trPr>
+          <w:jc w:val="center"/>
+        </w:trPr>
+        <w:tc>
+          <w:tcPr>
+            <w:tcW w:w="3360" w:type="dxa"/>
+          </w:tcPr>
+          <w:p>
+            <w:r>
+              <w:t>Locations</w:t>
+            </w:r>
+          </w:p>
+        </w:tc>
+        <w:tc>
+          <w:tcPr>
+            <w:tcW w:w="3360" w:type="dxa"/>
+          </w:tcPr>
+          <w:p>
+            <w:r>
+              <w:t>Country, region, city, users, sessions, engagement</w:t>
+            </w:r>
+          </w:p>
+        </w:tc>
+        <w:tc>
+          <w:tcPr>
+            <w:tcW w:w="3360" w:type="dxa"/>
+          </w:tcPr>
+          <w:p>
+            <w:r>
+              <w:t>Alphabetized grid.</w:t>
+            </w:r>
+          </w:p>
+        </w:tc>
+      </w:tr>
+      <w:tr>
+        <w:trPr>
+          <w:jc w:val="center"/>
+        </w:trPr>
+        <w:tc>
+          <w:tcPr>
+            <w:tcW w:w="3360" w:type="dxa"/>
+          </w:tcPr>
+          <w:p>
+            <w:r>
+              <w:t>Pages/downloads</w:t>
+            </w:r>
+          </w:p>
+        </w:tc>
+        <w:tc>
+          <w:tcPr>
+            <w:tcW w:w="3360" w:type="dxa"/>
+          </w:tcPr>
+          <w:p>
+            <w:r>
+              <w:t>Page title, path, event/action, users, event/download counts</w:t>
+            </w:r>
+          </w:p>
+        </w:tc>
+        <w:tc>
+          <w:tcPr>
+            <w:tcW w:w="3360" w:type="dxa"/>
+          </w:tcPr>
+          <w:p>
+            <w:r>
+              <w:t>Bar chart and supporting data logic.</w:t>
+            </w:r>
+          </w:p>
+        </w:tc>
+      </w:tr>
+      <w:tr>
+        <w:trPr>
+          <w:jc w:val="center"/>
+        </w:trPr>
+        <w:tc>
+          <w:tcPr>
+            <w:tcW w:w="3360" w:type="dxa"/>
+          </w:tcPr>
+          <w:p>
+            <w:r>
+              <w:t>Users trend</w:t>
+            </w:r>
+          </w:p>
+        </w:tc>
+        <w:tc>
+          <w:tcPr>
+            <w:tcW w:w="3360" w:type="dxa"/>
+          </w:tcPr>
+          <w:p>
+            <w:r>
+              <w:t>Daily users over selected date range</w:t>
+            </w:r>
+          </w:p>
+        </w:tc>
+        <w:tc>
+          <w:tcPr>
+            <w:tcW w:w="3360" w:type="dxa"/>
+          </w:tcPr>
+          <w:p>
+            <w:r>
+              <w:t>Bar graph with tooltip.</w:t>
+            </w:r>
+          </w:p>
+        </w:tc>
+      </w:tr>
+      <w:tr>
+        <w:trPr>
+          <w:jc w:val="center"/>
+        </w:trPr>
+        <w:tc>
+          <w:tcPr>
+            <w:tcW w:w="3360" w:type="dxa"/>
+          </w:tcPr>
+          <w:p>
+            <w:r>
+              <w:t>Realtime</w:t>
+            </w:r>
+          </w:p>
+        </w:tc>
+        <w:tc>
+          <w:tcPr>
+            <w:tcW w:w="3360" w:type="dxa"/>
+          </w:tcPr>
+          <w:p>
+            <w:r>
+              <w:t>Active users and realtime location/activity dimensions</w:t>
+            </w:r>
+          </w:p>
+        </w:tc>
+        <w:tc>
+          <w:tcPr>
+            <w:tcW w:w="3360" w:type="dxa"/>
+          </w:tcPr>
+          <w:p>
+            <w:r>
+              <w:t>Realtime panel.</w:t>
+            </w:r>
+          </w:p>
+        </w:tc>
+      </w:tr>
+    </w:tbl>
+    <w:p>
+      <w:pPr>
+        <w:jc w:val="center"/>
+      </w:pPr>
+      <w:r>
+        <w:rPr>
+          <w:noProof/>
+        </w:rPr>
+        <w:lastRenderedPageBreak/>
+        <w:drawing>
+          <wp:inline distT="0" distB="0" distL="0" distR="0" wp14:anchorId="18F75318" wp14:editId="633B89F9">
+            <wp:extent cx="5303520" cy="2058082"/>
+            <wp:effectExtent l="0" t="0" r="0" b="0"/>
+            <wp:docPr id="2" name="Picture 2"/>
+            <wp:cNvGraphicFramePr>
+              <a:graphicFrameLocks xmlns:a="http://schemas.openxmlformats.org/drawingml/2006/main" noChangeAspect="1"/>
+            </wp:cNvGraphicFramePr>
+            <a:graphic xmlns:a="http://schemas.openxmlformats.org/drawingml/2006/main">
+              <a:graphicData uri="http://schemas.openxmlformats.org/drawingml/2006/picture">
+                <pic:pic xmlns:pic="http://schemas.openxmlformats.org/drawingml/2006/picture">
+                  <pic:nvPicPr>
+                    <pic:cNvPr id="0" name="real-summary-cards.png"/>
+                    <pic:cNvPicPr/>
+                  </pic:nvPicPr>
+                  <pic:blipFill>
+                    <a:blip r:embed="rId7"/>
+                    <a:stretch>
+                      <a:fillRect/>
+                    </a:stretch>
+                  </pic:blipFill>
+                  <pic:spPr>
+                    <a:xfrm>
+                      <a:off x="0" y="0"/>
+                      <a:ext cx="5303520" cy="2058082"/>
+                    </a:xfrm>
+                    <a:prstGeom prst="rect">
+                      <a:avLst/>
+                    </a:prstGeom>
+                  </pic:spPr>
+                </pic:pic>
+              </a:graphicData>
+            </a:graphic>
+          </wp:inline>
+        </w:drawing>
+      </w:r>
+    </w:p>
+    <w:p>
+      <w:pPr>
+        <w:jc w:val="center"/>
+      </w:pPr>
+      <w:r>
+        <w:rPr>
+          <w:i/>
+          <w:color w:val="64748B"/>
+          <w:sz w:val="18"/>
+        </w:rPr>
+        <w:t>Actual summary-card area used to expose high-value GA4 metrics.</w:t>
+      </w:r>
+    </w:p>
+    <w:p>
+      <w:pPr>
+        <w:pStyle w:val="Heading1"/>
+      </w:pPr>
+      <w:bookmarkStart w:id="6" w:name="_Toc235734973"/>
+      <w:r>
+        <w:t>6. Authentication and Refresh Tokens</w:t>
+      </w:r>
+      <w:bookmarkEnd w:id="6"/>
+    </w:p>
+    <w:p>
+      <w:r>
+        <w:t>The app uses Google desktop OAuth. The browser sign-in returns to a loopback redirect URI. The app exchanges the authorization code for tokens. The access token is held in memory. The refresh token is encrypted with Windows DPAPI and saved in the SQLite settings database so startup can reconnect silently.</w:t>
+      </w:r>
+    </w:p>
+    <w:p>
+      <w:pPr>
+        <w:jc w:val="center"/>
+      </w:pPr>
+      <w:r>
+        <w:rPr>
+          <w:noProof/>
+        </w:rPr>
+        <w:drawing>
+          <wp:inline distT="0" distB="0" distL="0" distR="0" wp14:anchorId="7E28EF84" wp14:editId="0379A7E6">
+            <wp:extent cx="5760720" cy="2812966"/>
+            <wp:effectExtent l="0" t="0" r="0" b="0"/>
+            <wp:docPr id="3" name="Picture 3"/>
+            <wp:cNvGraphicFramePr>
+              <a:graphicFrameLocks xmlns:a="http://schemas.openxmlformats.org/drawingml/2006/main" noChangeAspect="1"/>
+            </wp:cNvGraphicFramePr>
+            <a:graphic xmlns:a="http://schemas.openxmlformats.org/drawingml/2006/main">
+              <a:graphicData uri="http://schemas.openxmlformats.org/drawingml/2006/picture">
+                <pic:pic xmlns:pic="http://schemas.openxmlformats.org/drawingml/2006/picture">
+                  <pic:nvPicPr>
+                    <pic:cNvPr id="0" name="real-settings-redacted.png"/>
+                    <pic:cNvPicPr/>
+                  </pic:nvPicPr>
+                  <pic:blipFill>
+                    <a:blip r:embed="rId8"/>
+                    <a:stretch>
+                      <a:fillRect/>
+                    </a:stretch>
+                  </pic:blipFill>
+                  <pic:spPr>
+                    <a:xfrm>
+                      <a:off x="0" y="0"/>
+                      <a:ext cx="5760720" cy="2812966"/>
+                    </a:xfrm>
+                    <a:prstGeom prst="rect">
+                      <a:avLst/>
+                    </a:prstGeom>
+                  </pic:spPr>
+                </pic:pic>
+              </a:graphicData>
+            </a:graphic>
+          </wp:inline>
+        </w:drawing>
+      </w:r>
+    </w:p>
+    <w:p>
+      <w:pPr>
+        <w:jc w:val="center"/>
+      </w:pPr>
+      <w:r>
+        <w:rPr>
+          <w:i/>
+          <w:color w:val="64748B"/>
+          <w:sz w:val="18"/>
+        </w:rPr>
+        <w:t>Actual settings area with credentials and status redacted.</w:t>
+      </w:r>
+    </w:p>
+    <w:p>
+      <w:pPr>
+        <w:pStyle w:val="ListBullet"/>
+      </w:pPr>
+      <w:r>
+        <w:t>The OAuth client ID and secret belong to the user's own Google Cloud desktop OAuth client.</w:t>
+      </w:r>
+    </w:p>
+    <w:p>
+      <w:pPr>
+        <w:pStyle w:val="ListBullet"/>
+      </w:pPr>
+      <w:r>
+        <w:t>The saved refresh token should never be committed or included in a public release.</w:t>
+      </w:r>
+    </w:p>
+    <w:p>
+      <w:pPr>
+        <w:pStyle w:val="ListBullet"/>
+      </w:pPr>
+      <w:r>
+        <w:t>Disconnect clears the access token and saved encrypted refresh token.</w:t>
+      </w:r>
+    </w:p>
+    <w:p>
+      <w:pPr>
+        <w:pStyle w:val="ListBullet"/>
+      </w:pPr>
+      <w:r>
+        <w:t>Silent reconnect should be attempted before showing Google login screens.</w:t>
+      </w:r>
+    </w:p>
+    <w:p>
+      <w:pPr>
+        <w:pStyle w:val="Heading1"/>
+      </w:pPr>
+      <w:bookmarkStart w:id="7" w:name="_Toc235734974"/>
+      <w:r>
+        <w:t>7. All-Websites Merge Behavior</w:t>
+      </w:r>
+      <w:bookmarkEnd w:id="7"/>
+    </w:p>
+    <w:p>
+      <w:r>
+        <w:t>All-websites mode is not a separate GA4 property. It is an application-level merge across enabled properties. The app requests each enabled property, aggregates compatible metrics, and then updates the same dashboard controls. This makes the dashboard useful for a broad roll-up, but it also means labels such as Home or /downloads.html may represent the same path on more than one site.</w:t>
+      </w:r>
+    </w:p>
+    <w:p>
+      <w:pPr>
+        <w:pStyle w:val="ListBullet"/>
+      </w:pPr>
+      <w:r>
+        <w:lastRenderedPageBreak/>
+        <w:t>Additive metrics such as users, sessions, views, events, downloads, and scrolled users can be summed carefully.</w:t>
+      </w:r>
+    </w:p>
+    <w:p>
+      <w:pPr>
+        <w:pStyle w:val="ListBullet"/>
+      </w:pPr>
+      <w:r>
+        <w:t>Ratio metrics such as engagement rate and events/session should be recomputed or weighted, not blindly summed.</w:t>
+      </w:r>
+    </w:p>
+    <w:p>
+      <w:pPr>
+        <w:pStyle w:val="ListBullet"/>
+      </w:pPr>
+      <w:r>
+        <w:t>Trend points should be merged by date so the chart remains aligned to the selected range.</w:t>
+      </w:r>
+    </w:p>
+    <w:p>
+      <w:pPr>
+        <w:pStyle w:val="ListBullet"/>
+      </w:pPr>
+      <w:r>
+        <w:t>Content rows should be grouped by meaningful keys such as page title, path, and event/action.</w:t>
+      </w:r>
+    </w:p>
+    <w:p>
+      <w:pPr>
+        <w:pStyle w:val="ListBullet"/>
+      </w:pPr>
+      <w:r>
+        <w:t>Realtime all-sites data can be more expensive and potentially more confusing; individual property view is usually clearer.</w:t>
+      </w:r>
+    </w:p>
+    <w:p>
+      <w:pPr>
+        <w:pStyle w:val="Heading1"/>
+      </w:pPr>
+      <w:bookmarkStart w:id="8" w:name="_Toc235734975"/>
+      <w:r>
+        <w:t>8. SQLite Storage Model</w:t>
+      </w:r>
+      <w:bookmarkEnd w:id="8"/>
+    </w:p>
+    <w:p>
+      <w:r>
+        <w:t>SQLite is used for portable settings, not analytics warehousing. The local database may live beside the source or executable according to the current project setup. The schema SQL is tracked so a fresh database can be created, but real .sqlite3 files should be ignored by Git.</w:t>
       </w:r>
     </w:p>
     <w:tbl>
@@ -733,9 +2249,9 @@
         <w:tblLook w:val="04A0" w:firstRow="1" w:lastRow="0" w:firstColumn="1" w:lastColumn="0" w:noHBand="0" w:noVBand="1"/>
       </w:tblPr>
       <w:tblGrid>
-        <w:gridCol w:w="2915"/>
-        <w:gridCol w:w="4451"/>
-        <w:gridCol w:w="2954"/>
+        <w:gridCol w:w="3360"/>
+        <w:gridCol w:w="3360"/>
+        <w:gridCol w:w="3360"/>
       </w:tblGrid>
       <w:tr>
         <w:trPr>
@@ -744,33 +2260,33 @@
         <w:tc>
           <w:tcPr>
             <w:tcW w:w="3360" w:type="dxa"/>
-            <w:shd w:val="clear" w:color="auto" w:fill="E8EEF5"/>
+            <w:shd w:val="clear" w:color="auto" w:fill="F2F7FC"/>
           </w:tcPr>
           <w:p>
             <w:r>
-              <w:t>Area</w:t>
+              <w:t>Data category</w:t>
             </w:r>
           </w:p>
         </w:tc>
         <w:tc>
           <w:tcPr>
             <w:tcW w:w="3360" w:type="dxa"/>
-            <w:shd w:val="clear" w:color="auto" w:fill="E8EEF5"/>
+            <w:shd w:val="clear" w:color="auto" w:fill="F2F7FC"/>
           </w:tcPr>
           <w:p>
             <w:r>
-              <w:t>Primary unit</w:t>
+              <w:t>Stored?</w:t>
             </w:r>
           </w:p>
         </w:tc>
         <w:tc>
           <w:tcPr>
             <w:tcW w:w="3360" w:type="dxa"/>
-            <w:shd w:val="clear" w:color="auto" w:fill="E8EEF5"/>
+            <w:shd w:val="clear" w:color="auto" w:fill="F2F7FC"/>
           </w:tcPr>
           <w:p>
             <w:r>
-              <w:t>Purpose</w:t>
+              <w:t>Reason</w:t>
             </w:r>
           </w:p>
         </w:tc>
@@ -785,7 +2301,7 @@
           </w:tcPr>
           <w:p>
             <w:r>
-              <w:t>Dashboard form</w:t>
+              <w:t>Default website/date range</w:t>
             </w:r>
           </w:p>
         </w:tc>
@@ -795,7 +2311,7 @@
           </w:tcPr>
           <w:p>
             <w:r>
-              <w:t>WebsiteAnalytics.MainForm.pas/.fmx</w:t>
+              <w:t>Yes</w:t>
             </w:r>
           </w:p>
         </w:tc>
@@ -805,7 +2321,7 @@
           </w:tcPr>
           <w:p>
             <w:r>
-              <w:t>Hero, summary cards, chart paint boxes, grids, realtime panel, update timers.</w:t>
+              <w:t>User preference.</w:t>
             </w:r>
           </w:p>
         </w:tc>
@@ -820,7 +2336,7 @@
           </w:tcPr>
           <w:p>
             <w:r>
-              <w:t>GA4 access</w:t>
+              <w:t>Property definitions</w:t>
             </w:r>
           </w:p>
         </w:tc>
@@ -830,7 +2346,7 @@
           </w:tcPr>
           <w:p>
             <w:r>
-              <w:t>WebsiteAnalytics.GA4DataModule.pas</w:t>
+              <w:t>Yes</w:t>
             </w:r>
           </w:p>
         </w:tc>
@@ -840,7 +2356,7 @@
           </w:tcPr>
           <w:p>
             <w:r>
-              <w:t>Builds GA4 Data API and Realtime API requests and parses responses.</w:t>
+              <w:t>Needed to query GA4 properties.</w:t>
             </w:r>
           </w:p>
         </w:tc>
@@ -855,7 +2371,7 @@
           </w:tcPr>
           <w:p>
             <w:r>
-              <w:t>Authentication</w:t>
+              <w:t>Grid widths</w:t>
             </w:r>
           </w:p>
         </w:tc>
@@ -865,7 +2381,7 @@
           </w:tcPr>
           <w:p>
             <w:r>
-              <w:t>WebsiteAnalytics.AuthenticationDataModule.pas</w:t>
+              <w:t>Yes</w:t>
             </w:r>
           </w:p>
         </w:tc>
@@ -875,7 +2391,7 @@
           </w:tcPr>
           <w:p>
             <w:r>
-              <w:t>Desktop OAuth, loopback redirect, refresh-token persistence.</w:t>
+              <w:t>Preserve user's manual column adjustments.</w:t>
             </w:r>
           </w:p>
         </w:tc>
@@ -890,7 +2406,7 @@
           </w:tcPr>
           <w:p>
             <w:r>
-              <w:t>Settings</w:t>
+              <w:t>OAuth client setup</w:t>
             </w:r>
           </w:p>
         </w:tc>
@@ -900,7 +2416,7 @@
           </w:tcPr>
           <w:p>
             <w:r>
-              <w:t>WebsiteAnalytics.SettingsDataModule.pas</w:t>
+              <w:t>Yes</w:t>
             </w:r>
           </w:p>
         </w:tc>
@@ -910,7 +2426,7 @@
           </w:tcPr>
           <w:p>
             <w:r>
-              <w:t>Portable SQLite settings database and schema.</w:t>
+              <w:t>Needed for token exchange.</w:t>
             </w:r>
           </w:p>
         </w:tc>
@@ -925,7 +2441,7 @@
           </w:tcPr>
           <w:p>
             <w:r>
-              <w:t>Models</w:t>
+              <w:t>Encrypted refresh token</w:t>
             </w:r>
           </w:p>
         </w:tc>
@@ -935,7 +2451,7 @@
           </w:tcPr>
           <w:p>
             <w:r>
-              <w:t>WebsiteAnalytics.Models.pas</w:t>
+              <w:t>Yes</w:t>
             </w:r>
           </w:p>
         </w:tc>
@@ -945,7 +2461,42 @@
           </w:tcPr>
           <w:p>
             <w:r>
-              <w:t>Snapshots, KPI summaries, trend points, location/content rows.</w:t>
+              <w:t>Enables silent reconnect.</w:t>
+            </w:r>
+          </w:p>
+        </w:tc>
+      </w:tr>
+      <w:tr>
+        <w:trPr>
+          <w:jc w:val="center"/>
+        </w:trPr>
+        <w:tc>
+          <w:tcPr>
+            <w:tcW w:w="3360" w:type="dxa"/>
+          </w:tcPr>
+          <w:p>
+            <w:r>
+              <w:t>GA4 report rows</w:t>
+            </w:r>
+          </w:p>
+        </w:tc>
+        <w:tc>
+          <w:tcPr>
+            <w:tcW w:w="3360" w:type="dxa"/>
+          </w:tcPr>
+          <w:p>
+            <w:r>
+              <w:t>No</w:t>
+            </w:r>
+          </w:p>
+        </w:tc>
+        <w:tc>
+          <w:tcPr>
+            <w:tcW w:w="3360" w:type="dxa"/>
+          </w:tcPr>
+          <w:p>
+            <w:r>
+              <w:t>Memory-only design.</w:t>
             </w:r>
           </w:p>
         </w:tc>
@@ -955,12 +2506,56 @@
       <w:pPr>
         <w:pStyle w:val="Heading1"/>
       </w:pPr>
-      <w:bookmarkStart w:id="2" w:name="_Toc235732561"/>
+      <w:bookmarkStart w:id="9" w:name="_Toc235734976"/>
       <w:r>
-        <w:lastRenderedPageBreak/>
-        <w:t>Current Dashboard Surface</w:t>
+        <w:t>9. UI Implementation Notes</w:t>
       </w:r>
-      <w:bookmarkEnd w:id="2"/>
+      <w:bookmarkEnd w:id="9"/>
+    </w:p>
+    <w:p>
+      <w:r>
+        <w:t>The main form is intentionally a real FMX form rather than a runtime-built dashboard. Chart painting and data updates are runtime behavior, but control existence, general layout, captions, and editable form structure belong in the designer whenever possible.</w:t>
+      </w:r>
+    </w:p>
+    <w:p>
+      <w:pPr>
+        <w:pStyle w:val="ListBullet"/>
+      </w:pPr>
+      <w:r>
+        <w:t>The bar charts are painted in paint boxes from in-memory trend/top-page data.</w:t>
+      </w:r>
+    </w:p>
+    <w:p>
+      <w:pPr>
+        <w:pStyle w:val="ListBullet"/>
+      </w:pPr>
+      <w:r>
+        <w:t>Tooltips are compact overlays for exact chart values.</w:t>
+      </w:r>
+    </w:p>
+    <w:p>
+      <w:pPr>
+        <w:pStyle w:val="ListBullet"/>
+      </w:pPr>
+      <w:r>
+        <w:t>The grids use FMX string grids and saved column widths.</w:t>
+      </w:r>
+    </w:p>
+    <w:p>
+      <w:pPr>
+        <w:pStyle w:val="ListBullet"/>
+      </w:pPr>
+      <w:r>
+        <w:t>Property/date selection and tab changes should trigger appropriate data refresh behavior.</w:t>
+      </w:r>
+    </w:p>
+    <w:p>
+      <w:pPr>
+        <w:pStyle w:val="ListBullet"/>
+      </w:pPr>
+      <w:r>
+        <w:t>Avoid code that silently resizes or rebuilds controls unless explicitly approved.</w:t>
+      </w:r>
     </w:p>
     <w:p>
       <w:pPr>
@@ -970,11 +2565,12 @@
         <w:rPr>
           <w:noProof/>
         </w:rPr>
+        <w:lastRenderedPageBreak/>
         <w:drawing>
-          <wp:inline distT="0" distB="0" distL="0" distR="0" wp14:anchorId="6FAF3C3A" wp14:editId="30A67794">
-            <wp:extent cx="5852160" cy="3474720"/>
+          <wp:inline distT="0" distB="0" distL="0" distR="0" wp14:anchorId="6D2AC94A" wp14:editId="1D791891">
+            <wp:extent cx="5760720" cy="3421838"/>
             <wp:effectExtent l="0" t="0" r="0" b="0"/>
-            <wp:docPr id="1" name="Picture 1"/>
+            <wp:docPr id="4" name="Picture 4"/>
             <wp:cNvGraphicFramePr>
               <a:graphicFrameLocks xmlns:a="http://schemas.openxmlformats.org/drawingml/2006/main" noChangeAspect="1"/>
             </wp:cNvGraphicFramePr>
@@ -982,11 +2578,11 @@
               <a:graphicData uri="http://schemas.openxmlformats.org/drawingml/2006/picture">
                 <pic:pic xmlns:pic="http://schemas.openxmlformats.org/drawingml/2006/picture">
                   <pic:nvPicPr>
-                    <pic:cNvPr id="0" name="dashboard-overview-sanitized.png"/>
+                    <pic:cNvPr id="0" name="real-users-graph.png"/>
                     <pic:cNvPicPr/>
                   </pic:nvPicPr>
                   <pic:blipFill>
-                    <a:blip r:embed="rId6"/>
+                    <a:blip r:embed="rId9"/>
                     <a:stretch>
                       <a:fillRect/>
                     </a:stretch>
@@ -994,7 +2590,7 @@
                   <pic:spPr>
                     <a:xfrm>
                       <a:off x="0" y="0"/>
-                      <a:ext cx="5852160" cy="3474720"/>
+                      <a:ext cx="5760720" cy="3421838"/>
                     </a:xfrm>
                     <a:prstGeom prst="rect">
                       <a:avLst/>
@@ -1017,72 +2613,420 @@
           <w:color w:val="64748B"/>
           <w:sz w:val="18"/>
         </w:rPr>
-        <w:t>Current surface area with sanitized data.</w:t>
+        <w:t>Actual users graph showing a selected date range.</w:t>
       </w:r>
     </w:p>
     <w:p>
       <w:pPr>
         <w:pStyle w:val="Heading1"/>
       </w:pPr>
-      <w:bookmarkStart w:id="3" w:name="_Toc235732562"/>
+      <w:bookmarkStart w:id="10" w:name="_Toc235734977"/>
       <w:r>
-        <w:t>GA4 Reports Used</w:t>
+        <w:t>10. GA4 Request and Parser Notes</w:t>
       </w:r>
-      <w:bookmarkEnd w:id="3"/>
+      <w:bookmarkEnd w:id="10"/>
     </w:p>
     <w:p>
-      <w:pPr>
-        <w:pStyle w:val="ListBullet"/>
-      </w:pPr>
       <w:r>
-        <w:t>Overview/KPI requests include users, sessions, screen/page views, engagement rate, event count, events per session, and scrolled users.</w:t>
+        <w:t>GA4 responses must be parsed defensively. Some successful responses contain no rows. Some dimensions return (not set). Realtime responses may return fewer dimensions than standard runReport responses. The code should treat missing rows as no data rather than as a fatal parser failure.</w:t>
+      </w:r>
+    </w:p>
+    <w:tbl>
+      <w:tblPr>
+        <w:tblStyle w:val="TableGrid"/>
+        <w:tblW w:w="0" w:type="auto"/>
+        <w:jc w:val="center"/>
+        <w:tblCellMar>
+          <w:top w:w="120" w:type="dxa"/>
+          <w:left w:w="120" w:type="dxa"/>
+          <w:bottom w:w="120" w:type="dxa"/>
+          <w:right w:w="120" w:type="dxa"/>
+        </w:tblCellMar>
+        <w:tblLook w:val="04A0" w:firstRow="1" w:lastRow="0" w:firstColumn="1" w:lastColumn="0" w:noHBand="0" w:noVBand="1"/>
+      </w:tblPr>
+      <w:tblGrid>
+        <w:gridCol w:w="5040"/>
+        <w:gridCol w:w="5040"/>
+      </w:tblGrid>
+      <w:tr>
+        <w:trPr>
+          <w:jc w:val="center"/>
+        </w:trPr>
+        <w:tc>
+          <w:tcPr>
+            <w:tcW w:w="5040" w:type="dxa"/>
+            <w:shd w:val="clear" w:color="auto" w:fill="F2F7FC"/>
+          </w:tcPr>
+          <w:p>
+            <w:r>
+              <w:t>Condition</w:t>
+            </w:r>
+          </w:p>
+        </w:tc>
+        <w:tc>
+          <w:tcPr>
+            <w:tcW w:w="5040" w:type="dxa"/>
+            <w:shd w:val="clear" w:color="auto" w:fill="F2F7FC"/>
+          </w:tcPr>
+          <w:p>
+            <w:r>
+              <w:t>Expected engineering behavior</w:t>
+            </w:r>
+          </w:p>
+        </w:tc>
+      </w:tr>
+      <w:tr>
+        <w:trPr>
+          <w:jc w:val="center"/>
+        </w:trPr>
+        <w:tc>
+          <w:tcPr>
+            <w:tcW w:w="5040" w:type="dxa"/>
+          </w:tcPr>
+          <w:p>
+            <w:r>
+              <w:t>No rows</w:t>
+            </w:r>
+          </w:p>
+        </w:tc>
+        <w:tc>
+          <w:tcPr>
+            <w:tcW w:w="5040" w:type="dxa"/>
+          </w:tcPr>
+          <w:p>
+            <w:r>
+              <w:t>Clear the relevant model list and display zero/None/no rows gracefully.</w:t>
+            </w:r>
+          </w:p>
+        </w:tc>
+      </w:tr>
+      <w:tr>
+        <w:trPr>
+          <w:jc w:val="center"/>
+        </w:trPr>
+        <w:tc>
+          <w:tcPr>
+            <w:tcW w:w="5040" w:type="dxa"/>
+          </w:tcPr>
+          <w:p>
+            <w:r>
+              <w:t>Missing rows member</w:t>
+            </w:r>
+          </w:p>
+        </w:tc>
+        <w:tc>
+          <w:tcPr>
+            <w:tcW w:w="5040" w:type="dxa"/>
+          </w:tcPr>
+          <w:p>
+            <w:r>
+              <w:t>Treat as empty rather than throwing a user-facing parser error.</w:t>
+            </w:r>
+          </w:p>
+        </w:tc>
+      </w:tr>
+      <w:tr>
+        <w:trPr>
+          <w:jc w:val="center"/>
+        </w:trPr>
+        <w:tc>
+          <w:tcPr>
+            <w:tcW w:w="5040" w:type="dxa"/>
+          </w:tcPr>
+          <w:p>
+            <w:r>
+              <w:t>Wrong property ID</w:t>
+            </w:r>
+          </w:p>
+        </w:tc>
+        <w:tc>
+          <w:tcPr>
+            <w:tcW w:w="5040" w:type="dxa"/>
+          </w:tcPr>
+          <w:p>
+            <w:r>
+              <w:t>Show the GA4 HTTP error clearly.</w:t>
+            </w:r>
+          </w:p>
+        </w:tc>
+      </w:tr>
+      <w:tr>
+        <w:trPr>
+          <w:jc w:val="center"/>
+        </w:trPr>
+        <w:tc>
+          <w:tcPr>
+            <w:tcW w:w="5040" w:type="dxa"/>
+          </w:tcPr>
+          <w:p>
+            <w:r>
+              <w:t>Permission denied</w:t>
+            </w:r>
+          </w:p>
+        </w:tc>
+        <w:tc>
+          <w:tcPr>
+            <w:tcW w:w="5040" w:type="dxa"/>
+          </w:tcPr>
+          <w:p>
+            <w:r>
+              <w:t>Show enough of the 403 message to guide the user to GA4 Admin access/property ID checks.</w:t>
+            </w:r>
+          </w:p>
+        </w:tc>
+      </w:tr>
+      <w:tr>
+        <w:trPr>
+          <w:jc w:val="center"/>
+        </w:trPr>
+        <w:tc>
+          <w:tcPr>
+            <w:tcW w:w="5040" w:type="dxa"/>
+          </w:tcPr>
+          <w:p>
+            <w:r>
+              <w:t>Token expired</w:t>
+            </w:r>
+          </w:p>
+        </w:tc>
+        <w:tc>
+          <w:tcPr>
+            <w:tcW w:w="5040" w:type="dxa"/>
+          </w:tcPr>
+          <w:p>
+            <w:r>
+              <w:t>Attempt one refresh/retry before asking the user to reconnect.</w:t>
+            </w:r>
+          </w:p>
+        </w:tc>
+      </w:tr>
+      <w:tr>
+        <w:trPr>
+          <w:jc w:val="center"/>
+        </w:trPr>
+        <w:tc>
+          <w:tcPr>
+            <w:tcW w:w="5040" w:type="dxa"/>
+          </w:tcPr>
+          <w:p>
+            <w:r>
+              <w:t>Realtime location missing</w:t>
+            </w:r>
+          </w:p>
+        </w:tc>
+        <w:tc>
+          <w:tcPr>
+            <w:tcW w:w="5040" w:type="dxa"/>
+          </w:tcPr>
+          <w:p>
+            <w:r>
+              <w:t xml:space="preserve">Show None or Current location: None rather than stale </w:t>
+            </w:r>
+            <w:r>
+              <w:lastRenderedPageBreak/>
+              <w:t>location text.</w:t>
+            </w:r>
+          </w:p>
+        </w:tc>
+      </w:tr>
+    </w:tbl>
+    <w:p>
+      <w:pPr>
+        <w:pStyle w:val="Heading1"/>
+      </w:pPr>
+      <w:bookmarkStart w:id="11" w:name="_Toc235734978"/>
+      <w:r>
+        <w:lastRenderedPageBreak/>
+        <w:t>11. Build and Smoke Test</w:t>
+      </w:r>
+      <w:bookmarkEnd w:id="11"/>
+    </w:p>
+    <w:p>
+      <w:pPr>
+        <w:pStyle w:val="ListNumber"/>
+      </w:pPr>
+      <w:r>
+        <w:t>Run the RAD Studio environment setup from C:\Program Files (x86)\Embarcadero\Studio\37.0\bin\rsvars.bat.</w:t>
       </w:r>
     </w:p>
     <w:p>
       <w:pPr>
-        <w:pStyle w:val="ListBullet"/>
+        <w:pStyle w:val="ListNumber"/>
       </w:pPr>
       <w:r>
-        <w:t>Trend requests normalize missing dates so the chart can show a complete selected range.</w:t>
+        <w:t>Build Win64 Debug with MSBuild.</w:t>
       </w:r>
     </w:p>
     <w:p>
       <w:pPr>
-        <w:pStyle w:val="ListBullet"/>
+        <w:pStyle w:val="ListNumber"/>
       </w:pPr>
       <w:r>
-        <w:t>Geography requests group country, region, city, users, sessions, and engagement information.</w:t>
+        <w:t>Build Win32 Debug with MSBuild.</w:t>
       </w:r>
     </w:p>
     <w:p>
       <w:pPr>
-        <w:pStyle w:val="ListBullet"/>
+        <w:pStyle w:val="ListNumber"/>
       </w:pPr>
       <w:r>
-        <w:t>Content requests group page title, path, action/event, users, and event/download counts.</w:t>
+        <w:t>Start the executable briefly with startup authentication disabled when appropriate to catch FMX read errors.</w:t>
       </w:r>
     </w:p>
     <w:p>
       <w:pPr>
-        <w:pStyle w:val="ListBullet"/>
+        <w:pStyle w:val="ListNumber"/>
       </w:pPr>
       <w:r>
-        <w:t>Realtime requests read active users, realtime views, and the current/last activity location when GA4 returns those dimensions.</w:t>
+        <w:t>If the executable is locked, close any running WebsiteAnalytics.exe process and rebuild.</w:t>
       </w:r>
     </w:p>
     <w:p>
       <w:pPr>
         <w:pStyle w:val="Heading1"/>
       </w:pPr>
-      <w:bookmarkStart w:id="4" w:name="_Toc235732563"/>
+      <w:bookmarkStart w:id="12" w:name="_Toc235734979"/>
       <w:r>
-        <w:t>Authentication and Token Storage</w:t>
+        <w:t>12. Release and Repository Checklist</w:t>
       </w:r>
-      <w:bookmarkEnd w:id="4"/>
+      <w:bookmarkEnd w:id="12"/>
     </w:p>
     <w:p>
+      <w:pPr>
+        <w:pStyle w:val="ListNumber"/>
+      </w:pPr>
       <w:r>
-        <w:t>The app uses a Google desktop OAuth client. On first sign-in the loopback listener receives an authorization code, exchanges it for tokens, and stores the refresh token encrypted for the current Windows user. Startup attempts a silent token refresh before showing any browser login screens.</w:t>
+        <w:t>Run a private-info scan against documents, help, source text, and tracked configuration files.</w:t>
+      </w:r>
+    </w:p>
+    <w:p>
+      <w:pPr>
+        <w:pStyle w:val="ListNumber"/>
+      </w:pPr>
+      <w:r>
+        <w:t>Verify .gitignore excludes databases/*.sqlite3 and other local credential material.</w:t>
+      </w:r>
+    </w:p>
+    <w:p>
+      <w:pPr>
+        <w:pStyle w:val="ListNumber"/>
+      </w:pPr>
+      <w:r>
+        <w:t>Build Win64 and Win32.</w:t>
+      </w:r>
+    </w:p>
+    <w:p>
+      <w:pPr>
+        <w:pStyle w:val="ListNumber"/>
+      </w:pPr>
+      <w:r>
+        <w:t>Start the app and confirm the main form loads without FMX property/read errors.</w:t>
+      </w:r>
+    </w:p>
+    <w:p>
+      <w:pPr>
+        <w:pStyle w:val="ListNumber"/>
+      </w:pPr>
+      <w:r>
+        <w:t>Verify help opens from the Help button.</w:t>
+      </w:r>
+    </w:p>
+    <w:p>
+      <w:pPr>
+        <w:pStyle w:val="ListNumber"/>
+      </w:pPr>
+      <w:r>
+        <w:t>Confirm User Guide and Engineering Guide exist as both DOCX and PDF.</w:t>
+      </w:r>
+    </w:p>
+    <w:p>
+      <w:pPr>
+        <w:pStyle w:val="ListNumber"/>
+      </w:pPr>
+      <w:r>
+        <w:t>Review git status and stage only intended files.</w:t>
+      </w:r>
+    </w:p>
+    <w:p>
+      <w:pPr>
+        <w:pStyle w:val="ListNumber"/>
+      </w:pPr>
+      <w:r>
+        <w:t>Commit the private repository.</w:t>
+      </w:r>
+    </w:p>
+    <w:p>
+      <w:pPr>
+        <w:pStyle w:val="ListNumber"/>
+      </w:pPr>
+      <w:r>
+        <w:t>Mirror safe files to the public repository.</w:t>
+      </w:r>
+    </w:p>
+    <w:p>
+      <w:pPr>
+        <w:pStyle w:val="ListNumber"/>
+      </w:pPr>
+      <w:r>
+        <w:t>Commit and push the public repository.</w:t>
+      </w:r>
+    </w:p>
+    <w:p>
+      <w:pPr>
+        <w:pStyle w:val="Heading1"/>
+      </w:pPr>
+      <w:bookmarkStart w:id="13" w:name="_Toc235734980"/>
+      <w:r>
+        <w:t>13. Public Repository Hygiene</w:t>
+      </w:r>
+      <w:bookmarkEnd w:id="13"/>
+    </w:p>
+    <w:p>
+      <w:pPr>
+        <w:pStyle w:val="ListBullet"/>
+      </w:pPr>
+      <w:r>
+        <w:t>Never commit real SQLite databases.</w:t>
+      </w:r>
+    </w:p>
+    <w:p>
+      <w:pPr>
+        <w:pStyle w:val="ListBullet"/>
+      </w:pPr>
+      <w:r>
+        <w:t>Never commit OAuth secrets, refresh tokens, credential JSON files, PEM files, or .env files.</w:t>
+      </w:r>
+    </w:p>
+    <w:p>
+      <w:pPr>
+        <w:pStyle w:val="ListBullet"/>
+      </w:pPr>
+      <w:r>
+        <w:t>Never commit screenshots that show private property IDs, personal locations, or developer-only data.</w:t>
+      </w:r>
+    </w:p>
+    <w:p>
+      <w:pPr>
+        <w:pStyle w:val="ListBullet"/>
+      </w:pPr>
+      <w:r>
+        <w:t>Use sanitized real screenshots in documentation.</w:t>
+      </w:r>
+    </w:p>
+    <w:p>
+      <w:pPr>
+        <w:pStyle w:val="ListBullet"/>
+      </w:pPr>
+      <w:r>
+        <w:t>Track schema SQL, source, help, guides, and safe image/icon assets.</w:t>
+      </w:r>
+    </w:p>
+    <w:p>
+      <w:pPr>
+        <w:pStyle w:val="ListBullet"/>
+      </w:pPr>
+      <w:r>
+        <w:t>Keep private and public repos synchronized only after reviewing the diff for secrets.</w:t>
       </w:r>
     </w:p>
     <w:p>
@@ -1095,10 +3039,10 @@
         </w:rPr>
         <w:lastRenderedPageBreak/>
         <w:drawing>
-          <wp:inline distT="0" distB="0" distL="0" distR="0" wp14:anchorId="7D464200" wp14:editId="0B5F0705">
-            <wp:extent cx="5577840" cy="3155883"/>
+          <wp:inline distT="0" distB="0" distL="0" distR="0" wp14:anchorId="49B02FBE" wp14:editId="0724674A">
+            <wp:extent cx="5577840" cy="2959670"/>
             <wp:effectExtent l="0" t="0" r="0" b="0"/>
-            <wp:docPr id="2" name="Picture 2"/>
+            <wp:docPr id="5" name="Picture 5"/>
             <wp:cNvGraphicFramePr>
               <a:graphicFrameLocks xmlns:a="http://schemas.openxmlformats.org/drawingml/2006/main" noChangeAspect="1"/>
             </wp:cNvGraphicFramePr>
@@ -1106,11 +3050,11 @@
               <a:graphicData uri="http://schemas.openxmlformats.org/drawingml/2006/picture">
                 <pic:pic xmlns:pic="http://schemas.openxmlformats.org/drawingml/2006/picture">
                   <pic:nvPicPr>
-                    <pic:cNvPr id="0" name="settings-redacted-clean.png"/>
+                    <pic:cNvPr id="0" name="real-properties-redacted.png"/>
                     <pic:cNvPicPr/>
                   </pic:nvPicPr>
                   <pic:blipFill>
-                    <a:blip r:embed="rId7"/>
+                    <a:blip r:embed="rId10"/>
                     <a:stretch>
                       <a:fillRect/>
                     </a:stretch>
@@ -1118,7 +3062,7 @@
                   <pic:spPr>
                     <a:xfrm>
                       <a:off x="0" y="0"/>
-                      <a:ext cx="5577840" cy="3155883"/>
+                      <a:ext cx="5577840" cy="2959670"/>
                     </a:xfrm>
                     <a:prstGeom prst="rect">
                       <a:avLst/>
@@ -1141,98 +3085,46 @@
           <w:color w:val="64748B"/>
           <w:sz w:val="18"/>
         </w:rPr>
-        <w:t>OAuth settings are shown with dummy values and a hidden client secret.</w:t>
+        <w:t>Actual property-management screen with site names and IDs redacted.</w:t>
       </w:r>
     </w:p>
     <w:p>
       <w:pPr>
         <w:pStyle w:val="Heading1"/>
       </w:pPr>
-      <w:bookmarkStart w:id="5" w:name="_Toc235732564"/>
+      <w:bookmarkStart w:id="14" w:name="_Toc235734981"/>
       <w:r>
-        <w:t>Portable SQLite Settings</w:t>
+        <w:t>14. Documentation Maintenance</w:t>
       </w:r>
-      <w:bookmarkEnd w:id="5"/>
+      <w:bookmarkEnd w:id="14"/>
     </w:p>
     <w:p>
       <w:r>
-        <w:t>The SQLite database stores application settings, property definitions, saved grid widths, OAuth setup values, and the encrypted refresh token. Report data remains memory-only.</w:t>
+        <w:t>Documentation should be rebuilt from actual UI captures and source behavior. Do not use synthetic mockups as screenshots. If an image is cropped from the UI, redact only the private values. The screenshot should still look like the real application.</w:t>
       </w:r>
     </w:p>
     <w:p>
       <w:pPr>
-        <w:jc w:val="center"/>
+        <w:pStyle w:val="ListBullet"/>
       </w:pPr>
       <w:r>
-        <w:rPr>
-          <w:noProof/>
-        </w:rPr>
-        <w:drawing>
-          <wp:inline distT="0" distB="0" distL="0" distR="0" wp14:anchorId="579CF899" wp14:editId="3BF9DEBF">
-            <wp:extent cx="5577840" cy="2642135"/>
-            <wp:effectExtent l="0" t="0" r="0" b="0"/>
-            <wp:docPr id="3" name="Picture 3"/>
-            <wp:cNvGraphicFramePr>
-              <a:graphicFrameLocks xmlns:a="http://schemas.openxmlformats.org/drawingml/2006/main" noChangeAspect="1"/>
-            </wp:cNvGraphicFramePr>
-            <a:graphic xmlns:a="http://schemas.openxmlformats.org/drawingml/2006/main">
-              <a:graphicData uri="http://schemas.openxmlformats.org/drawingml/2006/picture">
-                <pic:pic xmlns:pic="http://schemas.openxmlformats.org/drawingml/2006/picture">
-                  <pic:nvPicPr>
-                    <pic:cNvPr id="0" name="privacy-storage-clean.png"/>
-                    <pic:cNvPicPr/>
-                  </pic:nvPicPr>
-                  <pic:blipFill>
-                    <a:blip r:embed="rId8"/>
-                    <a:stretch>
-                      <a:fillRect/>
-                    </a:stretch>
-                  </pic:blipFill>
-                  <pic:spPr>
-                    <a:xfrm>
-                      <a:off x="0" y="0"/>
-                      <a:ext cx="5577840" cy="2642135"/>
-                    </a:xfrm>
-                    <a:prstGeom prst="rect">
-                      <a:avLst/>
-                    </a:prstGeom>
-                  </pic:spPr>
-                </pic:pic>
-              </a:graphicData>
-            </a:graphic>
-          </wp:inline>
-        </w:drawing>
+        <w:t>User Guide: friendly, procedural, and explanatory.</w:t>
       </w:r>
     </w:p>
     <w:p>
       <w:pPr>
-        <w:jc w:val="center"/>
+        <w:pStyle w:val="ListBullet"/>
       </w:pPr>
       <w:r>
-        <w:rPr>
-          <w:i/>
-          <w:color w:val="64748B"/>
-          <w:sz w:val="18"/>
-        </w:rPr>
-        <w:t>Storage responsibilities and Git tracking policy.</w:t>
+        <w:t>Engineering Guide: implementation details, architecture, build process, and safety rules.</w:t>
       </w:r>
     </w:p>
     <w:p>
       <w:pPr>
-        <w:pStyle w:val="Heading1"/>
-      </w:pPr>
-      <w:bookmarkStart w:id="6" w:name="_Toc235732565"/>
+        <w:pStyle w:val="ListBullet"/>
+      </w:pPr>
       <w:r>
-        <w:t>Designer/Editability Rules</w:t>
-      </w:r>
-      <w:bookmarkEnd w:id="6"/>
-    </w:p>
-    <w:p>
-      <w:pPr>
-        <w:pStyle w:val="ListBullet"/>
-      </w:pPr>
-      <w:r>
-        <w:t>FMX forms should remain editable in RAD Studio.</w:t>
+        <w:t>Help: concise but complete local help, with useful cropped screenshots per topic.</w:t>
       </w:r>
     </w:p>
     <w:p>
@@ -1240,15 +3132,268 @@
         <w:pStyle w:val="ListBullet"/>
       </w:pPr>
       <w:r>
-        <w:t>Do not add helper code or runtime UI layout code without developer approval.</w:t>
+        <w:t>All public screenshots: no personal city, account email, OAuth values, property IDs, or private paths.</w:t>
       </w:r>
     </w:p>
     <w:p>
       <w:pPr>
+        <w:pStyle w:val="Heading1"/>
+      </w:pPr>
+      <w:bookmarkStart w:id="15" w:name="_Toc235734982"/>
+      <w:r>
+        <w:t>15. Maintenance Risk Areas</w:t>
+      </w:r>
+      <w:bookmarkEnd w:id="15"/>
+    </w:p>
+    <w:tbl>
+      <w:tblPr>
+        <w:tblStyle w:val="TableGrid"/>
+        <w:tblW w:w="0" w:type="auto"/>
+        <w:jc w:val="center"/>
+        <w:tblCellMar>
+          <w:top w:w="120" w:type="dxa"/>
+          <w:left w:w="120" w:type="dxa"/>
+          <w:bottom w:w="120" w:type="dxa"/>
+          <w:right w:w="120" w:type="dxa"/>
+        </w:tblCellMar>
+        <w:tblLook w:val="04A0" w:firstRow="1" w:lastRow="0" w:firstColumn="1" w:lastColumn="0" w:noHBand="0" w:noVBand="1"/>
+      </w:tblPr>
+      <w:tblGrid>
+        <w:gridCol w:w="3360"/>
+        <w:gridCol w:w="3360"/>
+        <w:gridCol w:w="3360"/>
+      </w:tblGrid>
+      <w:tr>
+        <w:trPr>
+          <w:jc w:val="center"/>
+        </w:trPr>
+        <w:tc>
+          <w:tcPr>
+            <w:tcW w:w="3360" w:type="dxa"/>
+            <w:shd w:val="clear" w:color="auto" w:fill="F2F7FC"/>
+          </w:tcPr>
+          <w:p>
+            <w:r>
+              <w:t>Area</w:t>
+            </w:r>
+          </w:p>
+        </w:tc>
+        <w:tc>
+          <w:tcPr>
+            <w:tcW w:w="3360" w:type="dxa"/>
+            <w:shd w:val="clear" w:color="auto" w:fill="F2F7FC"/>
+          </w:tcPr>
+          <w:p>
+            <w:r>
+              <w:t>Risk</w:t>
+            </w:r>
+          </w:p>
+        </w:tc>
+        <w:tc>
+          <w:tcPr>
+            <w:tcW w:w="3360" w:type="dxa"/>
+            <w:shd w:val="clear" w:color="auto" w:fill="F2F7FC"/>
+          </w:tcPr>
+          <w:p>
+            <w:r>
+              <w:t>Mitigation</w:t>
+            </w:r>
+          </w:p>
+        </w:tc>
+      </w:tr>
+      <w:tr>
+        <w:trPr>
+          <w:jc w:val="center"/>
+        </w:trPr>
+        <w:tc>
+          <w:tcPr>
+            <w:tcW w:w="3360" w:type="dxa"/>
+          </w:tcPr>
+          <w:p>
+            <w:r>
+              <w:t>OAuth</w:t>
+            </w:r>
+          </w:p>
+        </w:tc>
+        <w:tc>
+          <w:tcPr>
+            <w:tcW w:w="3360" w:type="dxa"/>
+          </w:tcPr>
+          <w:p>
+            <w:r>
+              <w:t>Google policy or consent-screen changes can alter the login experience.</w:t>
+            </w:r>
+          </w:p>
+        </w:tc>
+        <w:tc>
+          <w:tcPr>
+            <w:tcW w:w="3360" w:type="dxa"/>
+          </w:tcPr>
+          <w:p>
+            <w:r>
+              <w:t>Keep setup docs current and test first-run flow periodically.</w:t>
+            </w:r>
+          </w:p>
+        </w:tc>
+      </w:tr>
+      <w:tr>
+        <w:trPr>
+          <w:jc w:val="center"/>
+        </w:trPr>
+        <w:tc>
+          <w:tcPr>
+            <w:tcW w:w="3360" w:type="dxa"/>
+          </w:tcPr>
+          <w:p>
+            <w:r>
+              <w:t>GA4 API</w:t>
+            </w:r>
+          </w:p>
+        </w:tc>
+        <w:tc>
+          <w:tcPr>
+            <w:tcW w:w="3360" w:type="dxa"/>
+          </w:tcPr>
+          <w:p>
+            <w:r>
+              <w:t>Metric/dimension names can change or behave differently.</w:t>
+            </w:r>
+          </w:p>
+        </w:tc>
+        <w:tc>
+          <w:tcPr>
+            <w:tcW w:w="3360" w:type="dxa"/>
+          </w:tcPr>
+          <w:p>
+            <w:r>
+              <w:t>Prefer official GA4 API docs and fail gracefully on missing rows.</w:t>
+            </w:r>
+          </w:p>
+        </w:tc>
+      </w:tr>
+      <w:tr>
+        <w:trPr>
+          <w:jc w:val="center"/>
+        </w:trPr>
+        <w:tc>
+          <w:tcPr>
+            <w:tcW w:w="3360" w:type="dxa"/>
+          </w:tcPr>
+          <w:p>
+            <w:r>
+              <w:t>FMX grids</w:t>
+            </w:r>
+          </w:p>
+        </w:tc>
+        <w:tc>
+          <w:tcPr>
+            <w:tcW w:w="3360" w:type="dxa"/>
+          </w:tcPr>
+          <w:p>
+            <w:r>
+              <w:t>Rendering quirks can appear at different sizes/DPI.</w:t>
+            </w:r>
+          </w:p>
+        </w:tc>
+        <w:tc>
+          <w:tcPr>
+            <w:tcW w:w="3360" w:type="dxa"/>
+          </w:tcPr>
+          <w:p>
+            <w:r>
+              <w:t>Avoid unnecessary grid-control churn; test visual changes at common resolutions.</w:t>
+            </w:r>
+          </w:p>
+        </w:tc>
+      </w:tr>
+      <w:tr>
+        <w:trPr>
+          <w:jc w:val="center"/>
+        </w:trPr>
+        <w:tc>
+          <w:tcPr>
+            <w:tcW w:w="3360" w:type="dxa"/>
+          </w:tcPr>
+          <w:p>
+            <w:r>
+              <w:lastRenderedPageBreak/>
+              <w:t>Public docs</w:t>
+            </w:r>
+          </w:p>
+        </w:tc>
+        <w:tc>
+          <w:tcPr>
+            <w:tcW w:w="3360" w:type="dxa"/>
+          </w:tcPr>
+          <w:p>
+            <w:r>
+              <w:t>Screenshots can accidentally reveal private data.</w:t>
+            </w:r>
+          </w:p>
+        </w:tc>
+        <w:tc>
+          <w:tcPr>
+            <w:tcW w:w="3360" w:type="dxa"/>
+          </w:tcPr>
+          <w:p>
+            <w:r>
+              <w:t>Use actual screenshots, crop to the area discussed, and redact private fields before committing.</w:t>
+            </w:r>
+          </w:p>
+        </w:tc>
+      </w:tr>
+      <w:tr>
+        <w:trPr>
+          <w:jc w:val="center"/>
+        </w:trPr>
+        <w:tc>
+          <w:tcPr>
+            <w:tcW w:w="3360" w:type="dxa"/>
+          </w:tcPr>
+          <w:p>
+            <w:r>
+              <w:t>All-sites merge</w:t>
+            </w:r>
+          </w:p>
+        </w:tc>
+        <w:tc>
+          <w:tcPr>
+            <w:tcW w:w="3360" w:type="dxa"/>
+          </w:tcPr>
+          <w:p>
+            <w:r>
+              <w:t>Ratios and duplicate labels can mislead.</w:t>
+            </w:r>
+          </w:p>
+        </w:tc>
+        <w:tc>
+          <w:tcPr>
+            <w:tcW w:w="3360" w:type="dxa"/>
+          </w:tcPr>
+          <w:p>
+            <w:r>
+              <w:t>Document what is merged and prefer individual property view for diagnosis.</w:t>
+            </w:r>
+          </w:p>
+        </w:tc>
+      </w:tr>
+    </w:tbl>
+    <w:p>
+      <w:pPr>
+        <w:pStyle w:val="Heading1"/>
+      </w:pPr>
+      <w:bookmarkStart w:id="16" w:name="_Toc235734983"/>
+      <w:r>
+        <w:t>16. Known Limitations and Future Work</w:t>
+      </w:r>
+      <w:bookmarkEnd w:id="16"/>
+    </w:p>
+    <w:p>
+      <w:pPr>
         <w:pStyle w:val="ListBullet"/>
       </w:pPr>
       <w:r>
-        <w:t>Prefer Object Inspector settings for control placement and sizing whenever practical.</w:t>
+        <w:t>GA4 realtime data and standard reports can disagree briefly because they are separate GA4 reporting surfaces.</w:t>
       </w:r>
     </w:p>
     <w:p>
@@ -1256,158 +3401,23 @@
         <w:pStyle w:val="ListBullet"/>
       </w:pPr>
       <w:r>
-        <w:lastRenderedPageBreak/>
-        <w:t>When runtime drawing is necessary for charts or tooltips, keep it limited to painting/data display, not form construction.</w:t>
+        <w:t>Some GA4 dimensions may return (not set). The app should display those rows rather than hiding them.</w:t>
       </w:r>
     </w:p>
     <w:p>
       <w:pPr>
-        <w:pStyle w:val="Heading1"/>
-      </w:pPr>
-      <w:bookmarkStart w:id="7" w:name="_Toc235732566"/>
+        <w:pStyle w:val="ListBullet"/>
+      </w:pPr>
       <w:r>
-        <w:t>Build and Validation</w:t>
-      </w:r>
-      <w:bookmarkEnd w:id="7"/>
-    </w:p>
-    <w:p>
-      <w:pPr>
-        <w:pStyle w:val="ListNumber"/>
-      </w:pPr>
-      <w:r>
-        <w:t>Create a pre-change backup on D: before modifying project files.</w:t>
+        <w:t>The current grid control can have minor FMX rendering quirks. Replacing it should be considered only if the benefit is worth the disruption.</w:t>
       </w:r>
     </w:p>
     <w:p>
       <w:pPr>
-        <w:pStyle w:val="ListNumber"/>
+        <w:pStyle w:val="ListBullet"/>
       </w:pPr>
       <w:r>
-        <w:t>Build Win64 and Win32 Debug with RAD Studio 37.0 MSBuild.</w:t>
-      </w:r>
-    </w:p>
-    <w:p>
-      <w:pPr>
-        <w:pStyle w:val="ListNumber"/>
-      </w:pPr>
-      <w:r>
-        <w:t>Smoke-test startup to catch FMX read errors.</w:t>
-      </w:r>
-    </w:p>
-    <w:p>
-      <w:pPr>
-        <w:pStyle w:val="ListNumber"/>
-      </w:pPr>
-      <w:r>
-        <w:t>Review Git status and stage only intended files.</w:t>
-      </w:r>
-    </w:p>
-    <w:p>
-      <w:pPr>
-        <w:pStyle w:val="ListNumber"/>
-      </w:pPr>
-      <w:r>
-        <w:t>Commit and push both the private and public repositories when the change is complete.</w:t>
-      </w:r>
-    </w:p>
-    <w:p>
-      <w:pPr>
-        <w:pStyle w:val="Heading1"/>
-      </w:pPr>
-      <w:bookmarkStart w:id="8" w:name="_Toc235732567"/>
-      <w:r>
-        <w:t>Public Repository Hygiene</w:t>
-      </w:r>
-      <w:bookmarkEnd w:id="8"/>
-    </w:p>
-    <w:p>
-      <w:pPr>
-        <w:pStyle w:val="ListBullet"/>
-      </w:pPr>
-      <w:r>
-        <w:t>Never commit a real SQLite database, OAuth client secret, refresh token, or personal property IDs.</w:t>
-      </w:r>
-    </w:p>
-    <w:p>
-      <w:pPr>
-        <w:pStyle w:val="ListBullet"/>
-      </w:pPr>
-      <w:r>
-        <w:t>Keep databases/WebsiteAnalytics.schema.sql tracked.</w:t>
-      </w:r>
-    </w:p>
-    <w:p>
-      <w:pPr>
-        <w:pStyle w:val="ListBullet"/>
-      </w:pPr>
-      <w:r>
-        <w:t>Use dummy property IDs and redacted OAuth examples in documentation.</w:t>
-      </w:r>
-    </w:p>
-    <w:p>
-      <w:pPr>
-        <w:pStyle w:val="ListBullet"/>
-      </w:pPr>
-      <w:r>
-        <w:t>Keep generated binaries and local build outputs ignored unless an explicit release artifact is being created.</w:t>
-      </w:r>
-    </w:p>
-    <w:p>
-      <w:pPr>
-        <w:jc w:val="center"/>
-      </w:pPr>
-      <w:r>
-        <w:rPr>
-          <w:noProof/>
-        </w:rPr>
-        <w:drawing>
-          <wp:inline distT="0" distB="0" distL="0" distR="0" wp14:anchorId="7BE32511" wp14:editId="5411FBA7">
-            <wp:extent cx="5577840" cy="2568742"/>
-            <wp:effectExtent l="0" t="0" r="0" b="0"/>
-            <wp:docPr id="4" name="Picture 4"/>
-            <wp:cNvGraphicFramePr>
-              <a:graphicFrameLocks xmlns:a="http://schemas.openxmlformats.org/drawingml/2006/main" noChangeAspect="1"/>
-            </wp:cNvGraphicFramePr>
-            <a:graphic xmlns:a="http://schemas.openxmlformats.org/drawingml/2006/main">
-              <a:graphicData uri="http://schemas.openxmlformats.org/drawingml/2006/picture">
-                <pic:pic xmlns:pic="http://schemas.openxmlformats.org/drawingml/2006/picture">
-                  <pic:nvPicPr>
-                    <pic:cNvPr id="0" name="properties-redacted-clean.png"/>
-                    <pic:cNvPicPr/>
-                  </pic:nvPicPr>
-                  <pic:blipFill>
-                    <a:blip r:embed="rId9"/>
-                    <a:stretch>
-                      <a:fillRect/>
-                    </a:stretch>
-                  </pic:blipFill>
-                  <pic:spPr>
-                    <a:xfrm>
-                      <a:off x="0" y="0"/>
-                      <a:ext cx="5577840" cy="2568742"/>
-                    </a:xfrm>
-                    <a:prstGeom prst="rect">
-                      <a:avLst/>
-                    </a:prstGeom>
-                  </pic:spPr>
-                </pic:pic>
-              </a:graphicData>
-            </a:graphic>
-          </wp:inline>
-        </w:drawing>
-      </w:r>
-    </w:p>
-    <w:p>
-      <w:pPr>
-        <w:jc w:val="center"/>
-      </w:pPr>
-      <w:r>
-        <w:rPr>
-          <w:i/>
-          <w:color w:val="64748B"/>
-          <w:sz w:val="18"/>
-        </w:rPr>
-        <w:t>Sanitized property examples suitable for public documentation.</w:t>
+        <w:t>CSV export, saved report snapshots, and additional graphs are possible future enhancements, but they would change the current memory-only philosophy.</w:t>
       </w:r>
     </w:p>
     <w:sectPr>
@@ -1593,31 +3603,31 @@
       </w:rPr>
     </w:lvl>
   </w:abstractNum>
-  <w:num w:numId="1" w16cid:durableId="595795204">
+  <w:num w:numId="1" w16cid:durableId="1389456917">
     <w:abstractNumId w:val="8"/>
   </w:num>
-  <w:num w:numId="2" w16cid:durableId="1199702193">
+  <w:num w:numId="2" w16cid:durableId="480511416">
     <w:abstractNumId w:val="6"/>
   </w:num>
-  <w:num w:numId="3" w16cid:durableId="669674393">
+  <w:num w:numId="3" w16cid:durableId="1419794656">
     <w:abstractNumId w:val="5"/>
   </w:num>
-  <w:num w:numId="4" w16cid:durableId="1618369397">
+  <w:num w:numId="4" w16cid:durableId="1502046944">
     <w:abstractNumId w:val="4"/>
   </w:num>
-  <w:num w:numId="5" w16cid:durableId="231894615">
+  <w:num w:numId="5" w16cid:durableId="2132741218">
     <w:abstractNumId w:val="7"/>
   </w:num>
-  <w:num w:numId="6" w16cid:durableId="1652439561">
+  <w:num w:numId="6" w16cid:durableId="2037466995">
     <w:abstractNumId w:val="3"/>
   </w:num>
-  <w:num w:numId="7" w16cid:durableId="1101952021">
+  <w:num w:numId="7" w16cid:durableId="614213562">
     <w:abstractNumId w:val="2"/>
   </w:num>
-  <w:num w:numId="8" w16cid:durableId="793671360">
+  <w:num w:numId="8" w16cid:durableId="851069584">
     <w:abstractNumId w:val="1"/>
   </w:num>
-  <w:num w:numId="9" w16cid:durableId="1046443549">
+  <w:num w:numId="9" w16cid:durableId="84152765">
     <w:abstractNumId w:val="0"/>
   </w:num>
 </w:numbering>
@@ -2014,7 +4024,7 @@
     <w:qFormat/>
     <w:rsid w:val="00FC693F"/>
     <w:pPr>
-      <w:spacing w:after="120"/>
+      <w:spacing w:after="120" w:line="269" w:lineRule="auto"/>
     </w:pPr>
     <w:rPr>
       <w:rFonts w:ascii="Calibri" w:hAnsi="Calibri"/>
@@ -2032,7 +4042,7 @@
     <w:pPr>
       <w:keepNext/>
       <w:keepLines/>
-      <w:spacing w:before="240"/>
+      <w:spacing w:before="280"/>
       <w:outlineLvl w:val="0"/>
     </w:pPr>
     <w:rPr>
@@ -2056,7 +4066,7 @@
     <w:pPr>
       <w:keepNext/>
       <w:keepLines/>
-      <w:spacing w:before="240"/>
+      <w:spacing w:before="180"/>
       <w:outlineLvl w:val="1"/>
     </w:pPr>
     <w:rPr>
@@ -2080,14 +4090,14 @@
     <w:pPr>
       <w:keepNext/>
       <w:keepLines/>
-      <w:spacing w:before="240"/>
+      <w:spacing w:before="180"/>
       <w:outlineLvl w:val="2"/>
     </w:pPr>
     <w:rPr>
       <w:rFonts w:asciiTheme="majorHAnsi" w:eastAsiaTheme="majorEastAsia" w:hAnsiTheme="majorHAnsi" w:cstheme="majorBidi"/>
       <w:b/>
       <w:bCs/>
-      <w:color w:val="1F4D78"/>
+      <w:color w:val="0B2341"/>
       <w:sz w:val="24"/>
     </w:rPr>
   </w:style>
@@ -13009,7 +15019,7 @@
     <w:autoRedefine/>
     <w:uiPriority w:val="39"/>
     <w:unhideWhenUsed/>
-    <w:rsid w:val="00082C3F"/>
+    <w:rsid w:val="00485D01"/>
     <w:pPr>
       <w:spacing w:after="100"/>
     </w:pPr>
@@ -13019,7 +15029,7 @@
     <w:basedOn w:val="DefaultParagraphFont"/>
     <w:uiPriority w:val="99"/>
     <w:unhideWhenUsed/>
-    <w:rsid w:val="00082C3F"/>
+    <w:rsid w:val="00485D01"/>
     <w:rPr>
       <w:color w:val="0000FF" w:themeColor="hyperlink"/>
       <w:u w:val="single"/>

</xml_diff>